<commit_message>
Add diagrams and report
</commit_message>
<xml_diff>
--- a/documentation/отчет itrex.docx
+++ b/documentation/отчет itrex.docx
@@ -1,6 +1,6 @@
 
 <file path=word/document.xml><?xml version="1.0" encoding="utf-8"?>
-<w:document xmlns:wpc="http://schemas.microsoft.com/office/word/2010/wordprocessingCanvas" xmlns:cx="http://schemas.microsoft.com/office/drawing/2014/chartex" xmlns:mc="http://schemas.openxmlformats.org/markup-compatibility/2006" xmlns:o="urn:schemas-microsoft-com:office:office" xmlns:r="http://schemas.openxmlformats.org/officeDocument/2006/relationships" xmlns:m="http://schemas.openxmlformats.org/officeDocument/2006/math" xmlns:v="urn:schemas-microsoft-com:vml" xmlns:wp14="http://schemas.microsoft.com/office/word/2010/wordprocessingDrawing" xmlns:wp="http://schemas.openxmlformats.org/drawingml/2006/wordprocessingDrawing" xmlns:w10="urn:schemas-microsoft-com:office:word" xmlns:w="http://schemas.openxmlformats.org/wordprocessingml/2006/main" xmlns:w14="http://schemas.microsoft.com/office/word/2010/wordml" xmlns:w15="http://schemas.microsoft.com/office/word/2012/wordml" xmlns:w16se="http://schemas.microsoft.com/office/word/2015/wordml/symex" xmlns:wpg="http://schemas.microsoft.com/office/word/2010/wordprocessingGroup" xmlns:wpi="http://schemas.microsoft.com/office/word/2010/wordprocessingInk" xmlns:wne="http://schemas.microsoft.com/office/word/2006/wordml" xmlns:wps="http://schemas.microsoft.com/office/word/2010/wordprocessingShape" mc:Ignorable="w14 w15 w16se wp14">
+<w:document xmlns:wpc="http://schemas.microsoft.com/office/word/2010/wordprocessingCanvas" xmlns:cx="http://schemas.microsoft.com/office/drawing/2014/chartex" xmlns:cx1="http://schemas.microsoft.com/office/drawing/2015/9/8/chartex" xmlns:cx2="http://schemas.microsoft.com/office/drawing/2015/10/21/chartex" xmlns:cx3="http://schemas.microsoft.com/office/drawing/2016/5/9/chartex" xmlns:cx4="http://schemas.microsoft.com/office/drawing/2016/5/10/chartex" xmlns:cx5="http://schemas.microsoft.com/office/drawing/2016/5/11/chartex" xmlns:cx6="http://schemas.microsoft.com/office/drawing/2016/5/12/chartex" xmlns:cx7="http://schemas.microsoft.com/office/drawing/2016/5/13/chartex" xmlns:cx8="http://schemas.microsoft.com/office/drawing/2016/5/14/chartex" xmlns:mc="http://schemas.openxmlformats.org/markup-compatibility/2006" xmlns:aink="http://schemas.microsoft.com/office/drawing/2016/ink" xmlns:am3d="http://schemas.microsoft.com/office/drawing/2017/model3d" xmlns:o="urn:schemas-microsoft-com:office:office" xmlns:oel="http://schemas.microsoft.com/office/2019/extlst" xmlns:r="http://schemas.openxmlformats.org/officeDocument/2006/relationships" xmlns:m="http://schemas.openxmlformats.org/officeDocument/2006/math" xmlns:v="urn:schemas-microsoft-com:vml" xmlns:wp14="http://schemas.microsoft.com/office/word/2010/wordprocessingDrawing" xmlns:wp="http://schemas.openxmlformats.org/drawingml/2006/wordprocessingDrawing" xmlns:w10="urn:schemas-microsoft-com:office:word" xmlns:w="http://schemas.openxmlformats.org/wordprocessingml/2006/main" xmlns:w14="http://schemas.microsoft.com/office/word/2010/wordml" xmlns:w15="http://schemas.microsoft.com/office/word/2012/wordml" xmlns:w16cex="http://schemas.microsoft.com/office/word/2018/wordml/cex" xmlns:w16cid="http://schemas.microsoft.com/office/word/2016/wordml/cid" xmlns:w16="http://schemas.microsoft.com/office/word/2018/wordml" xmlns:w16du="http://schemas.microsoft.com/office/word/2023/wordml/word16du" xmlns:w16sdtdh="http://schemas.microsoft.com/office/word/2020/wordml/sdtdatahash" xmlns:w16sdtfl="http://schemas.microsoft.com/office/word/2024/wordml/sdtformatlock" xmlns:w16se="http://schemas.microsoft.com/office/word/2015/wordml/symex" xmlns:wpg="http://schemas.microsoft.com/office/word/2010/wordprocessingGroup" xmlns:wpi="http://schemas.microsoft.com/office/word/2010/wordprocessingInk" xmlns:wne="http://schemas.microsoft.com/office/word/2006/wordml" xmlns:wps="http://schemas.microsoft.com/office/word/2010/wordprocessingShape" mc:Ignorable="w14 w15 w16se w16cid w16 w16cex w16sdtdh w16sdtfl w16du wp14">
   <w:body>
     <w:p>
       <w:pPr>
@@ -256,19 +256,8 @@
           <w:szCs w:val="28"/>
           <w:lang w:eastAsia="ru-RU"/>
         </w:rPr>
-        <w:t xml:space="preserve">____________ Ю.С. </w:t>
-      </w:r>
-      <w:proofErr w:type="spellStart"/>
-      <w:r>
-        <w:rPr>
-          <w:rFonts w:ascii="Times New Roman" w:eastAsia="Times New Roman" w:hAnsi="Times New Roman" w:cs="Times New Roman"/>
-          <w:sz w:val="28"/>
-          <w:szCs w:val="28"/>
-          <w:lang w:eastAsia="ru-RU"/>
-        </w:rPr>
-        <w:t>Мамшева</w:t>
-      </w:r>
-      <w:proofErr w:type="spellEnd"/>
+        <w:t>____________ Ю.С. Мамшева</w:t>
+      </w:r>
     </w:p>
     <w:p>
       <w:pPr>
@@ -621,25 +610,7 @@
           <w:sz w:val="28"/>
           <w:lang w:eastAsia="ru-RU"/>
         </w:rPr>
-        <w:t xml:space="preserve">итель: ___________ </w:t>
-      </w:r>
-      <w:proofErr w:type="spellStart"/>
-      <w:r>
-        <w:rPr>
-          <w:rFonts w:ascii="Times New Roman" w:eastAsia="Times New Roman" w:hAnsi="Times New Roman" w:cs="Times New Roman"/>
-          <w:sz w:val="28"/>
-          <w:lang w:eastAsia="ru-RU"/>
-        </w:rPr>
-        <w:t>Мамшева</w:t>
-      </w:r>
-      <w:proofErr w:type="spellEnd"/>
-      <w:r>
-        <w:rPr>
-          <w:rFonts w:ascii="Times New Roman" w:eastAsia="Times New Roman" w:hAnsi="Times New Roman" w:cs="Times New Roman"/>
-          <w:sz w:val="28"/>
-          <w:lang w:eastAsia="ru-RU"/>
-        </w:rPr>
-        <w:t xml:space="preserve"> Ю.С.</w:t>
+        <w:t>итель: ___________ Мамшева Ю.С.</w:t>
       </w:r>
       <w:r>
         <w:rPr>
@@ -2518,27 +2489,7 @@
           <w:szCs w:val="28"/>
           <w:lang w:eastAsia="ru-RU"/>
         </w:rPr>
-        <w:t>ООО «</w:t>
-      </w:r>
-      <w:proofErr w:type="spellStart"/>
-      <w:r>
-        <w:rPr>
-          <w:rFonts w:ascii="Times New Roman" w:eastAsia="Times New Roman" w:hAnsi="Times New Roman" w:cs="Times New Roman"/>
-          <w:sz w:val="28"/>
-          <w:szCs w:val="28"/>
-          <w:lang w:eastAsia="ru-RU"/>
-        </w:rPr>
-        <w:t>Айти</w:t>
-      </w:r>
-      <w:proofErr w:type="spellEnd"/>
-      <w:r>
-        <w:rPr>
-          <w:rFonts w:ascii="Times New Roman" w:eastAsia="Times New Roman" w:hAnsi="Times New Roman" w:cs="Times New Roman"/>
-          <w:sz w:val="28"/>
-          <w:szCs w:val="28"/>
-          <w:lang w:eastAsia="ru-RU"/>
-        </w:rPr>
-        <w:t xml:space="preserve"> Партнер»</w:t>
+        <w:t>ООО «Айти Партнер»</w:t>
       </w:r>
       <w:r>
         <w:rPr>
@@ -3474,27 +3425,7 @@
           <w:szCs w:val="28"/>
           <w:lang w:eastAsia="ru-RU"/>
         </w:rPr>
-        <w:t>ООО «</w:t>
-      </w:r>
-      <w:proofErr w:type="spellStart"/>
-      <w:r>
-        <w:rPr>
-          <w:rFonts w:ascii="Times New Roman" w:eastAsia="Times New Roman" w:hAnsi="Times New Roman" w:cs="Times New Roman"/>
-          <w:sz w:val="28"/>
-          <w:szCs w:val="28"/>
-          <w:lang w:eastAsia="ru-RU"/>
-        </w:rPr>
-        <w:t>Айти</w:t>
-      </w:r>
-      <w:proofErr w:type="spellEnd"/>
-      <w:r>
-        <w:rPr>
-          <w:rFonts w:ascii="Times New Roman" w:eastAsia="Times New Roman" w:hAnsi="Times New Roman" w:cs="Times New Roman"/>
-          <w:sz w:val="28"/>
-          <w:szCs w:val="28"/>
-          <w:lang w:eastAsia="ru-RU"/>
-        </w:rPr>
-        <w:t xml:space="preserve"> Партнер»</w:t>
+        <w:t>ООО «Айти Партнер»</w:t>
       </w:r>
       <w:r>
         <w:rPr>
@@ -3666,27 +3597,7 @@
           <w:szCs w:val="28"/>
           <w:lang w:eastAsia="ru-RU"/>
         </w:rPr>
-        <w:t xml:space="preserve">Крупному бизнесу - сетевым </w:t>
-      </w:r>
-      <w:proofErr w:type="spellStart"/>
-      <w:r>
-        <w:rPr>
-          <w:rFonts w:ascii="Times New Roman" w:eastAsia="Times New Roman" w:hAnsi="Times New Roman" w:cs="Times New Roman"/>
-          <w:sz w:val="28"/>
-          <w:szCs w:val="28"/>
-          <w:lang w:eastAsia="ru-RU"/>
-        </w:rPr>
-        <w:t>ритейлерам</w:t>
-      </w:r>
-      <w:proofErr w:type="spellEnd"/>
-      <w:r>
-        <w:rPr>
-          <w:rFonts w:ascii="Times New Roman" w:eastAsia="Times New Roman" w:hAnsi="Times New Roman" w:cs="Times New Roman"/>
-          <w:sz w:val="28"/>
-          <w:szCs w:val="28"/>
-          <w:lang w:eastAsia="ru-RU"/>
-        </w:rPr>
-        <w:t>, промышленным предприятиям, дистрибьюторам, логистическим компаниям.</w:t>
+        <w:t>Крупному бизнесу - сетевым ритейлерам, промышленным предприятиям, дистрибьюторам, логистическим компаниям.</w:t>
       </w:r>
     </w:p>
     <w:p>
@@ -3852,27 +3763,7 @@
           <w:szCs w:val="28"/>
           <w:lang w:eastAsia="ru-RU"/>
         </w:rPr>
-        <w:t xml:space="preserve">сканеры </w:t>
-      </w:r>
-      <w:proofErr w:type="spellStart"/>
-      <w:r>
-        <w:rPr>
-          <w:rFonts w:ascii="Times New Roman" w:eastAsia="Times New Roman" w:hAnsi="Times New Roman" w:cs="Times New Roman"/>
-          <w:sz w:val="28"/>
-          <w:szCs w:val="28"/>
-          <w:lang w:eastAsia="ru-RU"/>
-        </w:rPr>
-        <w:t>штрихкодов</w:t>
-      </w:r>
-      <w:proofErr w:type="spellEnd"/>
-      <w:r>
-        <w:rPr>
-          <w:rFonts w:ascii="Times New Roman" w:eastAsia="Times New Roman" w:hAnsi="Times New Roman" w:cs="Times New Roman"/>
-          <w:sz w:val="28"/>
-          <w:szCs w:val="28"/>
-          <w:lang w:eastAsia="ru-RU"/>
-        </w:rPr>
-        <w:t>, терминалы сбора данных (ТСД);</w:t>
+        <w:t>сканеры штрихкодов, терминалы сбора данных (ТСД);</w:t>
       </w:r>
     </w:p>
     <w:p>
@@ -4007,27 +3898,7 @@
           <w:lang w:eastAsia="ru-RU"/>
         </w:rPr>
         <w:lastRenderedPageBreak/>
-        <w:t xml:space="preserve">интеграция 1С с интернет‑магазинами, </w:t>
-      </w:r>
-      <w:proofErr w:type="spellStart"/>
-      <w:r>
-        <w:rPr>
-          <w:rFonts w:ascii="Times New Roman" w:eastAsia="Times New Roman" w:hAnsi="Times New Roman" w:cs="Times New Roman"/>
-          <w:sz w:val="28"/>
-          <w:szCs w:val="28"/>
-          <w:lang w:eastAsia="ru-RU"/>
-        </w:rPr>
-        <w:t>маркетплейсами</w:t>
-      </w:r>
-      <w:proofErr w:type="spellEnd"/>
-      <w:r>
-        <w:rPr>
-          <w:rFonts w:ascii="Times New Roman" w:eastAsia="Times New Roman" w:hAnsi="Times New Roman" w:cs="Times New Roman"/>
-          <w:sz w:val="28"/>
-          <w:szCs w:val="28"/>
-          <w:lang w:eastAsia="ru-RU"/>
-        </w:rPr>
-        <w:t>, CRM и ERP‑системами;</w:t>
+        <w:t>интеграция 1С с интернет‑магазинами, маркетплейсами, CRM и ERP‑системами;</w:t>
       </w:r>
     </w:p>
     <w:p>
@@ -4134,27 +4005,7 @@
           <w:szCs w:val="28"/>
           <w:lang w:eastAsia="ru-RU"/>
         </w:rPr>
-        <w:t xml:space="preserve">создание сайтов (корпоративные, визитки, </w:t>
-      </w:r>
-      <w:proofErr w:type="spellStart"/>
-      <w:r>
-        <w:rPr>
-          <w:rFonts w:ascii="Times New Roman" w:eastAsia="Times New Roman" w:hAnsi="Times New Roman" w:cs="Times New Roman"/>
-          <w:sz w:val="28"/>
-          <w:szCs w:val="28"/>
-          <w:lang w:eastAsia="ru-RU"/>
-        </w:rPr>
-        <w:t>лендинги</w:t>
-      </w:r>
-      <w:proofErr w:type="spellEnd"/>
-      <w:r>
-        <w:rPr>
-          <w:rFonts w:ascii="Times New Roman" w:eastAsia="Times New Roman" w:hAnsi="Times New Roman" w:cs="Times New Roman"/>
-          <w:sz w:val="28"/>
-          <w:szCs w:val="28"/>
-          <w:lang w:eastAsia="ru-RU"/>
-        </w:rPr>
-        <w:t>);</w:t>
+        <w:t>создание сайтов (корпоративные, визитки, лендинги);</w:t>
       </w:r>
     </w:p>
     <w:p>
@@ -4526,27 +4377,7 @@
           <w:szCs w:val="28"/>
           <w:lang w:eastAsia="ru-RU"/>
         </w:rPr>
-        <w:t>в качестве разрабатываемой системы выбрана тематика создания веб-платформы «</w:t>
-      </w:r>
-      <w:proofErr w:type="spellStart"/>
-      <w:r>
-        <w:rPr>
-          <w:rFonts w:ascii="Times New Roman" w:eastAsia="Times New Roman" w:hAnsi="Times New Roman" w:cs="Times New Roman"/>
-          <w:sz w:val="28"/>
-          <w:szCs w:val="28"/>
-          <w:lang w:eastAsia="ru-RU"/>
-        </w:rPr>
-        <w:t>ITRexHelper</w:t>
-      </w:r>
-      <w:proofErr w:type="spellEnd"/>
-      <w:r>
-        <w:rPr>
-          <w:rFonts w:ascii="Times New Roman" w:eastAsia="Times New Roman" w:hAnsi="Times New Roman" w:cs="Times New Roman"/>
-          <w:sz w:val="28"/>
-          <w:szCs w:val="28"/>
-          <w:lang w:eastAsia="ru-RU"/>
-        </w:rPr>
-        <w:t>» для автоматизации приема и обработки заявок на услуг</w:t>
+        <w:t>в качестве разрабатываемой системы выбрана тематика создания веб-платформы «ITRexHelper» для автоматизации приема и обработки заявок на услуг</w:t>
       </w:r>
       <w:r>
         <w:rPr>
@@ -4571,7 +4402,6 @@
           <w:lang w:eastAsia="ru-RU"/>
         </w:rPr>
       </w:pPr>
-      <w:proofErr w:type="spellStart"/>
       <w:r>
         <w:rPr>
           <w:rFonts w:ascii="Times New Roman" w:eastAsia="Times New Roman" w:hAnsi="Times New Roman" w:cs="Times New Roman"/>
@@ -4580,17 +4410,7 @@
           <w:lang w:eastAsia="ru-RU"/>
         </w:rPr>
         <w:lastRenderedPageBreak/>
-        <w:t>ITRexHelper</w:t>
-      </w:r>
-      <w:proofErr w:type="spellEnd"/>
-      <w:r>
-        <w:rPr>
-          <w:rFonts w:ascii="Times New Roman" w:eastAsia="Times New Roman" w:hAnsi="Times New Roman" w:cs="Times New Roman"/>
-          <w:sz w:val="28"/>
-          <w:szCs w:val="28"/>
-          <w:lang w:eastAsia="ru-RU"/>
-        </w:rPr>
-        <w:t xml:space="preserve"> </w:t>
+        <w:t xml:space="preserve">ITRexHelper </w:t>
       </w:r>
       <w:r>
         <w:rPr>
@@ -4640,27 +4460,7 @@
           <w:szCs w:val="28"/>
           <w:lang w:eastAsia="ru-RU"/>
         </w:rPr>
-        <w:t xml:space="preserve">Проект </w:t>
-      </w:r>
-      <w:proofErr w:type="spellStart"/>
-      <w:r>
-        <w:rPr>
-          <w:rFonts w:ascii="Times New Roman" w:eastAsia="Times New Roman" w:hAnsi="Times New Roman" w:cs="Times New Roman"/>
-          <w:sz w:val="28"/>
-          <w:szCs w:val="28"/>
-          <w:lang w:eastAsia="ru-RU"/>
-        </w:rPr>
-        <w:t>ITRexHelper</w:t>
-      </w:r>
-      <w:proofErr w:type="spellEnd"/>
-      <w:r>
-        <w:rPr>
-          <w:rFonts w:ascii="Times New Roman" w:eastAsia="Times New Roman" w:hAnsi="Times New Roman" w:cs="Times New Roman"/>
-          <w:sz w:val="28"/>
-          <w:szCs w:val="28"/>
-          <w:lang w:eastAsia="ru-RU"/>
-        </w:rPr>
-        <w:t xml:space="preserve"> актуален в связи с ростом числа заказов на IT-услуги</w:t>
+        <w:t>Проект ITRexHelper актуален в связи с ростом числа заказов на IT-услуги</w:t>
       </w:r>
       <w:r>
         <w:rPr>
@@ -4710,27 +4510,7 @@
           <w:szCs w:val="28"/>
           <w:lang w:eastAsia="ru-RU"/>
         </w:rPr>
-        <w:t>Актуальность разработки системы «</w:t>
-      </w:r>
-      <w:proofErr w:type="spellStart"/>
-      <w:r>
-        <w:rPr>
-          <w:rFonts w:ascii="Times New Roman" w:eastAsia="Times New Roman" w:hAnsi="Times New Roman" w:cs="Times New Roman"/>
-          <w:sz w:val="28"/>
-          <w:szCs w:val="28"/>
-          <w:lang w:eastAsia="ru-RU"/>
-        </w:rPr>
-        <w:t>ITRexHelper</w:t>
-      </w:r>
-      <w:proofErr w:type="spellEnd"/>
-      <w:r>
-        <w:rPr>
-          <w:rFonts w:ascii="Times New Roman" w:eastAsia="Times New Roman" w:hAnsi="Times New Roman" w:cs="Times New Roman"/>
-          <w:sz w:val="28"/>
-          <w:szCs w:val="28"/>
-          <w:lang w:eastAsia="ru-RU"/>
-        </w:rPr>
-        <w:t>» обусловлена несколькими ключевыми факторами в сфере управления клиентскими зап</w:t>
+        <w:t>Актуальность разработки системы «ITRexHelper» обусловлена несколькими ключевыми факторами в сфере управления клиентскими зап</w:t>
       </w:r>
       <w:r>
         <w:rPr>
@@ -4766,27 +4546,7 @@
           <w:szCs w:val="28"/>
           <w:lang w:eastAsia="ru-RU"/>
         </w:rPr>
-        <w:t>Потеря заявок и низкая скорость реакции. Когда клиенты отправляют запросы в произвольной форме (</w:t>
-      </w:r>
-      <w:proofErr w:type="spellStart"/>
-      <w:r>
-        <w:rPr>
-          <w:rFonts w:ascii="Times New Roman" w:eastAsia="Times New Roman" w:hAnsi="Times New Roman" w:cs="Times New Roman"/>
-          <w:sz w:val="28"/>
-          <w:szCs w:val="28"/>
-          <w:lang w:eastAsia="ru-RU"/>
-        </w:rPr>
-        <w:t>email</w:t>
-      </w:r>
-      <w:proofErr w:type="spellEnd"/>
-      <w:r>
-        <w:rPr>
-          <w:rFonts w:ascii="Times New Roman" w:eastAsia="Times New Roman" w:hAnsi="Times New Roman" w:cs="Times New Roman"/>
-          <w:sz w:val="28"/>
-          <w:szCs w:val="28"/>
-          <w:lang w:eastAsia="ru-RU"/>
-        </w:rPr>
-        <w:t xml:space="preserve">, Telegram, телефон), велик риск пропустить обращение или забыть ответить. </w:t>
+        <w:t xml:space="preserve">Потеря заявок и низкая скорость реакции. Когда клиенты отправляют запросы в произвольной форме (email, Telegram, телефон), велик риск пропустить обращение или забыть ответить. </w:t>
       </w:r>
     </w:p>
     <w:p>
@@ -4813,27 +4573,7 @@
           <w:szCs w:val="28"/>
           <w:lang w:eastAsia="ru-RU"/>
         </w:rPr>
-        <w:t>Отсутствие прозрачности для клиента. Пользователь, отправивший заявку по электронной почте, часто остается в неведении: принята ли она в работу, кто ее выполняет, когда будет результат. Это порождает повторные звонки и раздражение. В «</w:t>
-      </w:r>
-      <w:proofErr w:type="spellStart"/>
-      <w:r>
-        <w:rPr>
-          <w:rFonts w:ascii="Times New Roman" w:eastAsia="Times New Roman" w:hAnsi="Times New Roman" w:cs="Times New Roman"/>
-          <w:sz w:val="28"/>
-          <w:szCs w:val="28"/>
-          <w:lang w:eastAsia="ru-RU"/>
-        </w:rPr>
-        <w:t>ITRexHelper</w:t>
-      </w:r>
-      <w:proofErr w:type="spellEnd"/>
-      <w:r>
-        <w:rPr>
-          <w:rFonts w:ascii="Times New Roman" w:eastAsia="Times New Roman" w:hAnsi="Times New Roman" w:cs="Times New Roman"/>
-          <w:sz w:val="28"/>
-          <w:szCs w:val="28"/>
-          <w:lang w:eastAsia="ru-RU"/>
-        </w:rPr>
-        <w:t>» клиент видит статус своей заявки, может добавить комментарий и в любой момент обратиться в чат поддержки.</w:t>
+        <w:t>Отсутствие прозрачности для клиента. Пользователь, отправивший заявку по электронной почте, часто остается в неведении: принята ли она в работу, кто ее выполняет, когда будет результат. Это порождает повторные звонки и раздражение. В «ITRexHelper» клиент видит статус своей заявки, может добавить комментарий и в любой момент обратиться в чат поддержки.</w:t>
       </w:r>
     </w:p>
     <w:p>
@@ -4860,27 +4600,7 @@
           <w:szCs w:val="28"/>
           <w:lang w:eastAsia="ru-RU"/>
         </w:rPr>
-        <w:t>Неэффективное распределение нагрузки между сотрудниками. Без системы менеджеры назначают исполнителей «на глаз», не видя реальной загрузки коллег. Проект «</w:t>
-      </w:r>
-      <w:proofErr w:type="spellStart"/>
-      <w:r>
-        <w:rPr>
-          <w:rFonts w:ascii="Times New Roman" w:eastAsia="Times New Roman" w:hAnsi="Times New Roman" w:cs="Times New Roman"/>
-          <w:sz w:val="28"/>
-          <w:szCs w:val="28"/>
-          <w:lang w:eastAsia="ru-RU"/>
-        </w:rPr>
-        <w:t>ITRexHelper</w:t>
-      </w:r>
-      <w:proofErr w:type="spellEnd"/>
-      <w:r>
-        <w:rPr>
-          <w:rFonts w:ascii="Times New Roman" w:eastAsia="Times New Roman" w:hAnsi="Times New Roman" w:cs="Times New Roman"/>
-          <w:sz w:val="28"/>
-          <w:szCs w:val="28"/>
-          <w:lang w:eastAsia="ru-RU"/>
-        </w:rPr>
-        <w:t xml:space="preserve">» предоставляет аналитику по </w:t>
+        <w:t xml:space="preserve">Неэффективное распределение нагрузки между сотрудниками. Без системы менеджеры назначают исполнителей «на глаз», не видя реальной загрузки коллег. Проект «ITRexHelper» предоставляет аналитику по </w:t>
       </w:r>
       <w:r>
         <w:rPr>
@@ -4917,27 +4637,7 @@
           <w:szCs w:val="28"/>
           <w:lang w:eastAsia="ru-RU"/>
         </w:rPr>
-        <w:t>Сложность контроля коммуникации. Обсуждение деталей заявки часто ведется в нескольких каналах (почта, телефон, мессенджеры), теряется контекст. В системе «</w:t>
-      </w:r>
-      <w:proofErr w:type="spellStart"/>
-      <w:r>
-        <w:rPr>
-          <w:rFonts w:ascii="Times New Roman" w:eastAsia="Times New Roman" w:hAnsi="Times New Roman" w:cs="Times New Roman"/>
-          <w:sz w:val="28"/>
-          <w:szCs w:val="28"/>
-          <w:lang w:eastAsia="ru-RU"/>
-        </w:rPr>
-        <w:t>ITRexHelper</w:t>
-      </w:r>
-      <w:proofErr w:type="spellEnd"/>
-      <w:r>
-        <w:rPr>
-          <w:rFonts w:ascii="Times New Roman" w:eastAsia="Times New Roman" w:hAnsi="Times New Roman" w:cs="Times New Roman"/>
-          <w:sz w:val="28"/>
-          <w:szCs w:val="28"/>
-          <w:lang w:eastAsia="ru-RU"/>
-        </w:rPr>
-        <w:t>» все комментарии клиента и внутренние заметки сотрудника привязаны к конкретной заявке, хранятся в единой истории и сопровождаются уведомлениями об ответах.</w:t>
+        <w:t>Сложность контроля коммуникации. Обсуждение деталей заявки часто ведется в нескольких каналах (почта, телефон, мессенджеры), теряется контекст. В системе «ITRexHelper» все комментарии клиента и внутренние заметки сотрудника привязаны к конкретной заявке, хранятся в единой истории и сопровождаются уведомлениями об ответах.</w:t>
       </w:r>
     </w:p>
     <w:p>
@@ -4964,27 +4664,7 @@
           <w:szCs w:val="28"/>
           <w:lang w:eastAsia="ru-RU"/>
         </w:rPr>
-        <w:t>Трудности с отчетностью и анализом. Руководителю сложно оценить, сколько заявок было закрыто вовремя, какие типы услуг самые востребованные, кто из сотрудников перегружен. Модуль аналитики «</w:t>
-      </w:r>
-      <w:proofErr w:type="spellStart"/>
-      <w:r>
-        <w:rPr>
-          <w:rFonts w:ascii="Times New Roman" w:eastAsia="Times New Roman" w:hAnsi="Times New Roman" w:cs="Times New Roman"/>
-          <w:sz w:val="28"/>
-          <w:szCs w:val="28"/>
-          <w:lang w:eastAsia="ru-RU"/>
-        </w:rPr>
-        <w:t>ITRexHelper</w:t>
-      </w:r>
-      <w:proofErr w:type="spellEnd"/>
-      <w:r>
-        <w:rPr>
-          <w:rFonts w:ascii="Times New Roman" w:eastAsia="Times New Roman" w:hAnsi="Times New Roman" w:cs="Times New Roman"/>
-          <w:sz w:val="28"/>
-          <w:szCs w:val="28"/>
-          <w:lang w:eastAsia="ru-RU"/>
-        </w:rPr>
-        <w:t>» автоматически строит диаграммы по статусам, приоритетам и загрузке, позволяя принимать управленческие решения на основе данных.</w:t>
+        <w:t>Трудности с отчетностью и анализом. Руководителю сложно оценить, сколько заявок было закрыто вовремя, какие типы услуг самые востребованные, кто из сотрудников перегружен. Модуль аналитики «ITRexHelper» автоматически строит диаграммы по статусам, приоритетам и загрузке, позволяя принимать управленческие решения на основе данных.</w:t>
       </w:r>
     </w:p>
     <w:p>
@@ -5011,47 +4691,7 @@
           <w:szCs w:val="28"/>
           <w:lang w:eastAsia="ru-RU"/>
         </w:rPr>
-        <w:t>Необходимость работы с документами и договорами. После согласования заявки клиенту часто нужен договор или счет. «</w:t>
-      </w:r>
-      <w:proofErr w:type="spellStart"/>
-      <w:r>
-        <w:rPr>
-          <w:rFonts w:ascii="Times New Roman" w:eastAsia="Times New Roman" w:hAnsi="Times New Roman" w:cs="Times New Roman"/>
-          <w:sz w:val="28"/>
-          <w:szCs w:val="28"/>
-          <w:lang w:eastAsia="ru-RU"/>
-        </w:rPr>
-        <w:t>ITRexHelper</w:t>
-      </w:r>
-      <w:proofErr w:type="spellEnd"/>
-      <w:r>
-        <w:rPr>
-          <w:rFonts w:ascii="Times New Roman" w:eastAsia="Times New Roman" w:hAnsi="Times New Roman" w:cs="Times New Roman"/>
-          <w:sz w:val="28"/>
-          <w:szCs w:val="28"/>
-          <w:lang w:eastAsia="ru-RU"/>
-        </w:rPr>
-        <w:t xml:space="preserve">» поддерживает генерацию PDF-договоров из шаблонов, импорт исходных данных из </w:t>
-      </w:r>
-      <w:proofErr w:type="spellStart"/>
-      <w:r>
-        <w:rPr>
-          <w:rFonts w:ascii="Times New Roman" w:eastAsia="Times New Roman" w:hAnsi="Times New Roman" w:cs="Times New Roman"/>
-          <w:sz w:val="28"/>
-          <w:szCs w:val="28"/>
-          <w:lang w:eastAsia="ru-RU"/>
-        </w:rPr>
-        <w:t>Excel</w:t>
-      </w:r>
-      <w:proofErr w:type="spellEnd"/>
-      <w:r>
-        <w:rPr>
-          <w:rFonts w:ascii="Times New Roman" w:eastAsia="Times New Roman" w:hAnsi="Times New Roman" w:cs="Times New Roman"/>
-          <w:sz w:val="28"/>
-          <w:szCs w:val="28"/>
-          <w:lang w:eastAsia="ru-RU"/>
-        </w:rPr>
-        <w:t xml:space="preserve"> и выгрузку отчетности, что сокращает время на оформление документов в разы.</w:t>
+        <w:t>Необходимость работы с документами и договорами. После согласования заявки клиенту часто нужен договор или счет. «ITRexHelper» поддерживает генерацию PDF-договоров из шаблонов, импорт исходных данных из Excel и выгрузку отчетности, что сокращает время на оформление документов в разы.</w:t>
       </w:r>
     </w:p>
     <w:p>
@@ -5078,27 +4718,7 @@
           <w:szCs w:val="28"/>
           <w:lang w:eastAsia="ru-RU"/>
         </w:rPr>
-        <w:t>Цифровая трансформация компаний-интеграторов. Многие организации, оказывающие услуги автоматизации, переходят на единые цифровые платформы. «</w:t>
-      </w:r>
-      <w:proofErr w:type="spellStart"/>
-      <w:r>
-        <w:rPr>
-          <w:rFonts w:ascii="Times New Roman" w:eastAsia="Times New Roman" w:hAnsi="Times New Roman" w:cs="Times New Roman"/>
-          <w:sz w:val="28"/>
-          <w:szCs w:val="28"/>
-          <w:lang w:eastAsia="ru-RU"/>
-        </w:rPr>
-        <w:t>ITRexHelper</w:t>
-      </w:r>
-      <w:proofErr w:type="spellEnd"/>
-      <w:r>
-        <w:rPr>
-          <w:rFonts w:ascii="Times New Roman" w:eastAsia="Times New Roman" w:hAnsi="Times New Roman" w:cs="Times New Roman"/>
-          <w:sz w:val="28"/>
-          <w:szCs w:val="28"/>
-          <w:lang w:eastAsia="ru-RU"/>
-        </w:rPr>
-        <w:t>» может быть интегрирован как стандартное решение для приема заказов, позволяя руководителю отслеживать прогресс по каждой заявке, загрузку сотрудников и удовлетворенность клиентов без ручного сбора информации из разрозненных источников.</w:t>
+        <w:t>Цифровая трансформация компаний-интеграторов. Многие организации, оказывающие услуги автоматизации, переходят на единые цифровые платформы. «ITRexHelper» может быть интегрирован как стандартное решение для приема заказов, позволяя руководителю отслеживать прогресс по каждой заявке, загрузку сотрудников и удовлетворенность клиентов без ручного сбора информации из разрозненных источников.</w:t>
       </w:r>
     </w:p>
     <w:p>
@@ -5545,16 +5165,7 @@
           <w:szCs w:val="28"/>
           <w:lang w:eastAsia="ru-RU"/>
         </w:rPr>
-        <w:t xml:space="preserve">Клиент – зарегистрированный пользователь, который авторизовался в системе и может создавать заявки, просматривать их, общаться в чате </w:t>
-      </w:r>
-      <w:r>
-        <w:rPr>
-          <w:rFonts w:ascii="Times New Roman" w:eastAsia="Times New Roman" w:hAnsi="Times New Roman" w:cs="Times New Roman"/>
-          <w:sz w:val="28"/>
-          <w:szCs w:val="28"/>
-          <w:lang w:eastAsia="ru-RU"/>
-        </w:rPr>
-        <w:t>поддержки и скачивать договоры.</w:t>
+        <w:t>Клиент – зарегистрированный пользователь, который авторизовался в системе и может создавать заявки, просматривать их, общаться в чате поддержки и скачивать договоры.</w:t>
       </w:r>
     </w:p>
     <w:p>
@@ -5581,34 +5192,7 @@
           <w:szCs w:val="28"/>
           <w:lang w:eastAsia="ru-RU"/>
         </w:rPr>
-        <w:t xml:space="preserve">Сотрудник / Администратор </w:t>
-      </w:r>
-      <w:r>
-        <w:rPr>
-          <w:rFonts w:ascii="Times New Roman" w:eastAsia="Times New Roman" w:hAnsi="Times New Roman" w:cs="Times New Roman"/>
-          <w:sz w:val="28"/>
-          <w:szCs w:val="28"/>
-          <w:lang w:eastAsia="ru-RU"/>
-        </w:rPr>
-        <w:t>–</w:t>
-      </w:r>
-      <w:r>
-        <w:rPr>
-          <w:rFonts w:ascii="Times New Roman" w:eastAsia="Times New Roman" w:hAnsi="Times New Roman" w:cs="Times New Roman"/>
-          <w:sz w:val="28"/>
-          <w:szCs w:val="28"/>
-          <w:lang w:eastAsia="ru-RU"/>
-        </w:rPr>
-        <w:t xml:space="preserve"> пользователь с расширенными правами, который управляет заявками (просмотр, фильтрация, изменение статусов, назначение времени приёма), отвечает в чате, управляет пользователями, импортирует/экспортир</w:t>
-      </w:r>
-      <w:r>
-        <w:rPr>
-          <w:rFonts w:ascii="Times New Roman" w:eastAsia="Times New Roman" w:hAnsi="Times New Roman" w:cs="Times New Roman"/>
-          <w:sz w:val="28"/>
-          <w:szCs w:val="28"/>
-          <w:lang w:eastAsia="ru-RU"/>
-        </w:rPr>
-        <w:t>ует данные и генерирует отчёты.</w:t>
+        <w:t>Сотрудник / Администратор – пользователь с расширенными правами, который управляет заявками (просмотр, фильтрация, изменение статусов, назначение времени приёма), отвечает в чате, управляет пользователями, импортирует/экспортирует данные и генерирует отчёты.</w:t>
       </w:r>
     </w:p>
     <w:p>
@@ -5658,16 +5242,7 @@
           <w:szCs w:val="28"/>
           <w:lang w:eastAsia="ru-RU"/>
         </w:rPr>
-        <w:t>Регистрация – клиент со</w:t>
-      </w:r>
-      <w:r>
-        <w:rPr>
-          <w:rFonts w:ascii="Times New Roman" w:eastAsia="Times New Roman" w:hAnsi="Times New Roman" w:cs="Times New Roman"/>
-          <w:sz w:val="28"/>
-          <w:szCs w:val="28"/>
-          <w:lang w:eastAsia="ru-RU"/>
-        </w:rPr>
-        <w:t>здаёт учётную запись в системе.</w:t>
+        <w:t>Регистрация – клиент создаёт учётную запись в системе.</w:t>
       </w:r>
     </w:p>
     <w:p>
@@ -5694,16 +5269,7 @@
           <w:szCs w:val="28"/>
           <w:lang w:eastAsia="ru-RU"/>
         </w:rPr>
-        <w:t>Вход в систему – клиент авторизуется дл</w:t>
-      </w:r>
-      <w:r>
-        <w:rPr>
-          <w:rFonts w:ascii="Times New Roman" w:eastAsia="Times New Roman" w:hAnsi="Times New Roman" w:cs="Times New Roman"/>
-          <w:sz w:val="28"/>
-          <w:szCs w:val="28"/>
-          <w:lang w:eastAsia="ru-RU"/>
-        </w:rPr>
-        <w:t>я получения доступа к функциям.</w:t>
+        <w:t>Вход в систему – клиент авторизуется для получения доступа к функциям.</w:t>
       </w:r>
     </w:p>
     <w:p>
@@ -5730,16 +5296,7 @@
           <w:szCs w:val="28"/>
           <w:lang w:eastAsia="ru-RU"/>
         </w:rPr>
-        <w:t>Создать заявку – клиент оформляет заявку на услугу, включая описани</w:t>
-      </w:r>
-      <w:r>
-        <w:rPr>
-          <w:rFonts w:ascii="Times New Roman" w:eastAsia="Times New Roman" w:hAnsi="Times New Roman" w:cs="Times New Roman"/>
-          <w:sz w:val="28"/>
-          <w:szCs w:val="28"/>
-          <w:lang w:eastAsia="ru-RU"/>
-        </w:rPr>
-        <w:t>е проблемы и контактные данные.</w:t>
+        <w:t>Создать заявку – клиент оформляет заявку на услугу, включая описание проблемы и контактные данные.</w:t>
       </w:r>
     </w:p>
     <w:p>
@@ -5766,16 +5323,7 @@
           <w:szCs w:val="28"/>
           <w:lang w:eastAsia="ru-RU"/>
         </w:rPr>
-        <w:t xml:space="preserve">Просмотр всех заявок – клиент </w:t>
-      </w:r>
-      <w:r>
-        <w:rPr>
-          <w:rFonts w:ascii="Times New Roman" w:eastAsia="Times New Roman" w:hAnsi="Times New Roman" w:cs="Times New Roman"/>
-          <w:sz w:val="28"/>
-          <w:szCs w:val="28"/>
-          <w:lang w:eastAsia="ru-RU"/>
-        </w:rPr>
-        <w:t>видит список всех своих заявок.</w:t>
+        <w:t>Просмотр всех заявок – клиент видит список всех своих заявок.</w:t>
       </w:r>
     </w:p>
     <w:p>
@@ -5802,16 +5350,7 @@
           <w:szCs w:val="28"/>
           <w:lang w:eastAsia="ru-RU"/>
         </w:rPr>
-        <w:t>Добавить комментарий к заявке – клиент может остав</w:t>
-      </w:r>
-      <w:r>
-        <w:rPr>
-          <w:rFonts w:ascii="Times New Roman" w:eastAsia="Times New Roman" w:hAnsi="Times New Roman" w:cs="Times New Roman"/>
-          <w:sz w:val="28"/>
-          <w:szCs w:val="28"/>
-          <w:lang w:eastAsia="ru-RU"/>
-        </w:rPr>
-        <w:t>ить комментарий к своей заявке.</w:t>
+        <w:t>Добавить комментарий к заявке – клиент может оставить комментарий к своей заявке.</w:t>
       </w:r>
     </w:p>
     <w:p>
@@ -5838,16 +5377,7 @@
           <w:szCs w:val="28"/>
           <w:lang w:eastAsia="ru-RU"/>
         </w:rPr>
-        <w:t>Внести данные компании – внесение реквизито</w:t>
-      </w:r>
-      <w:r>
-        <w:rPr>
-          <w:rFonts w:ascii="Times New Roman" w:eastAsia="Times New Roman" w:hAnsi="Times New Roman" w:cs="Times New Roman"/>
-          <w:sz w:val="28"/>
-          <w:szCs w:val="28"/>
-          <w:lang w:eastAsia="ru-RU"/>
-        </w:rPr>
-        <w:t>в компании при создании заявки.</w:t>
+        <w:t>Внести данные компании – внесение реквизитов компании при создании заявки.</w:t>
       </w:r>
     </w:p>
     <w:p>
@@ -5874,36 +5404,7 @@
           <w:szCs w:val="28"/>
           <w:lang w:eastAsia="ru-RU"/>
         </w:rPr>
-        <w:t xml:space="preserve">Оставить контактные данные – внесение телефона и </w:t>
-      </w:r>
-      <w:proofErr w:type="spellStart"/>
-      <w:r>
-        <w:rPr>
-          <w:rFonts w:ascii="Times New Roman" w:eastAsia="Times New Roman" w:hAnsi="Times New Roman" w:cs="Times New Roman"/>
-          <w:sz w:val="28"/>
-          <w:szCs w:val="28"/>
-          <w:lang w:eastAsia="ru-RU"/>
-        </w:rPr>
-        <w:t>email</w:t>
-      </w:r>
-      <w:proofErr w:type="spellEnd"/>
-      <w:r>
-        <w:rPr>
-          <w:rFonts w:ascii="Times New Roman" w:eastAsia="Times New Roman" w:hAnsi="Times New Roman" w:cs="Times New Roman"/>
-          <w:sz w:val="28"/>
-          <w:szCs w:val="28"/>
-          <w:lang w:eastAsia="ru-RU"/>
-        </w:rPr>
-        <w:t xml:space="preserve"> при соз</w:t>
-      </w:r>
-      <w:r>
-        <w:rPr>
-          <w:rFonts w:ascii="Times New Roman" w:eastAsia="Times New Roman" w:hAnsi="Times New Roman" w:cs="Times New Roman"/>
-          <w:sz w:val="28"/>
-          <w:szCs w:val="28"/>
-          <w:lang w:eastAsia="ru-RU"/>
-        </w:rPr>
-        <w:t>дании заявки.</w:t>
+        <w:t>Оставить контактные данные – внесение телефона и email при создании заявки.</w:t>
       </w:r>
     </w:p>
     <w:p>
@@ -5930,16 +5431,7 @@
           <w:szCs w:val="28"/>
           <w:lang w:eastAsia="ru-RU"/>
         </w:rPr>
-        <w:t>Обращение в чат поддержки – клиент открыва</w:t>
-      </w:r>
-      <w:r>
-        <w:rPr>
-          <w:rFonts w:ascii="Times New Roman" w:eastAsia="Times New Roman" w:hAnsi="Times New Roman" w:cs="Times New Roman"/>
-          <w:sz w:val="28"/>
-          <w:szCs w:val="28"/>
-          <w:lang w:eastAsia="ru-RU"/>
-        </w:rPr>
-        <w:t>ет чат для вопросов вне заявки.</w:t>
+        <w:t>Обращение в чат поддержки – клиент открывает чат для вопросов вне заявки.</w:t>
       </w:r>
     </w:p>
     <w:p>
@@ -5966,16 +5458,7 @@
           <w:szCs w:val="28"/>
           <w:lang w:eastAsia="ru-RU"/>
         </w:rPr>
-        <w:t>Отправить сообщение в чат – базово</w:t>
-      </w:r>
-      <w:r>
-        <w:rPr>
-          <w:rFonts w:ascii="Times New Roman" w:eastAsia="Times New Roman" w:hAnsi="Times New Roman" w:cs="Times New Roman"/>
-          <w:sz w:val="28"/>
-          <w:szCs w:val="28"/>
-          <w:lang w:eastAsia="ru-RU"/>
-        </w:rPr>
-        <w:t>е действие при обращении в чат.</w:t>
+        <w:t>Отправить сообщение в чат – базовое действие при обращении в чат.</w:t>
       </w:r>
     </w:p>
     <w:p>
@@ -6003,16 +5486,7 @@
           <w:lang w:eastAsia="ru-RU"/>
         </w:rPr>
         <w:lastRenderedPageBreak/>
-        <w:t>Скачать договор по заявке (PDF) – клиент скачива</w:t>
-      </w:r>
-      <w:r>
-        <w:rPr>
-          <w:rFonts w:ascii="Times New Roman" w:eastAsia="Times New Roman" w:hAnsi="Times New Roman" w:cs="Times New Roman"/>
-          <w:sz w:val="28"/>
-          <w:szCs w:val="28"/>
-          <w:lang w:eastAsia="ru-RU"/>
-        </w:rPr>
-        <w:t>ет PDF-договор по своей заявке.</w:t>
+        <w:t>Скачать договор по заявке (PDF) – клиент скачивает PDF-договор по своей заявке.</w:t>
       </w:r>
     </w:p>
     <w:p>
@@ -6039,16 +5513,7 @@
           <w:szCs w:val="28"/>
           <w:lang w:eastAsia="ru-RU"/>
         </w:rPr>
-        <w:t>Вход в систему как сотрудник/администратор – авто</w:t>
-      </w:r>
-      <w:r>
-        <w:rPr>
-          <w:rFonts w:ascii="Times New Roman" w:eastAsia="Times New Roman" w:hAnsi="Times New Roman" w:cs="Times New Roman"/>
-          <w:sz w:val="28"/>
-          <w:szCs w:val="28"/>
-          <w:lang w:eastAsia="ru-RU"/>
-        </w:rPr>
-        <w:t>ризация с расширенными правами.</w:t>
+        <w:t>Вход в систему как сотрудник/администратор – авторизация с расширенными правами.</w:t>
       </w:r>
     </w:p>
     <w:p>
@@ -6075,16 +5540,7 @@
           <w:szCs w:val="28"/>
           <w:lang w:eastAsia="ru-RU"/>
         </w:rPr>
-        <w:t xml:space="preserve">Просмотр всех заявок – сотрудник видит все </w:t>
-      </w:r>
-      <w:r>
-        <w:rPr>
-          <w:rFonts w:ascii="Times New Roman" w:eastAsia="Times New Roman" w:hAnsi="Times New Roman" w:cs="Times New Roman"/>
-          <w:sz w:val="28"/>
-          <w:szCs w:val="28"/>
-          <w:lang w:eastAsia="ru-RU"/>
-        </w:rPr>
-        <w:t>заявки всех клиентов в системе.</w:t>
+        <w:t>Просмотр всех заявок – сотрудник видит все заявки всех клиентов в системе.</w:t>
       </w:r>
     </w:p>
     <w:p>
@@ -6111,16 +5567,7 @@
           <w:szCs w:val="28"/>
           <w:lang w:eastAsia="ru-RU"/>
         </w:rPr>
-        <w:t>Фильтрация – сотрудник фильтрует заявки по статусу,</w:t>
-      </w:r>
-      <w:r>
-        <w:rPr>
-          <w:rFonts w:ascii="Times New Roman" w:eastAsia="Times New Roman" w:hAnsi="Times New Roman" w:cs="Times New Roman"/>
-          <w:sz w:val="28"/>
-          <w:szCs w:val="28"/>
-          <w:lang w:eastAsia="ru-RU"/>
-        </w:rPr>
-        <w:t xml:space="preserve"> приоритету, дате, исполнителю.</w:t>
+        <w:t>Фильтрация – сотрудник фильтрует заявки по статусу, приоритету, дате, исполнителю.</w:t>
       </w:r>
     </w:p>
     <w:p>
@@ -6147,16 +5594,7 @@
           <w:szCs w:val="28"/>
           <w:lang w:eastAsia="ru-RU"/>
         </w:rPr>
-        <w:t>Изменения данных заявок – сотрудник р</w:t>
-      </w:r>
-      <w:r>
-        <w:rPr>
-          <w:rFonts w:ascii="Times New Roman" w:eastAsia="Times New Roman" w:hAnsi="Times New Roman" w:cs="Times New Roman"/>
-          <w:sz w:val="28"/>
-          <w:szCs w:val="28"/>
-          <w:lang w:eastAsia="ru-RU"/>
-        </w:rPr>
-        <w:t>едактирует данные любой заявки.</w:t>
+        <w:t>Изменения данных заявок – сотрудник редактирует данные любой заявки.</w:t>
       </w:r>
     </w:p>
     <w:p>
@@ -6183,16 +5621,7 @@
           <w:szCs w:val="28"/>
           <w:lang w:eastAsia="ru-RU"/>
         </w:rPr>
-        <w:t>Изменение статуса – сотрудник меняет статус заявки (на</w:t>
-      </w:r>
-      <w:r>
-        <w:rPr>
-          <w:rFonts w:ascii="Times New Roman" w:eastAsia="Times New Roman" w:hAnsi="Times New Roman" w:cs="Times New Roman"/>
-          <w:sz w:val="28"/>
-          <w:szCs w:val="28"/>
-          <w:lang w:eastAsia="ru-RU"/>
-        </w:rPr>
-        <w:t>пример, «в работе», «закрыта»).</w:t>
+        <w:t>Изменение статуса – сотрудник меняет статус заявки (например, «в работе», «закрыта»).</w:t>
       </w:r>
     </w:p>
     <w:p>
@@ -6219,16 +5648,7 @@
           <w:szCs w:val="28"/>
           <w:lang w:eastAsia="ru-RU"/>
         </w:rPr>
-        <w:t>Назначить время приёма – сотрудник назначае</w:t>
-      </w:r>
-      <w:r>
-        <w:rPr>
-          <w:rFonts w:ascii="Times New Roman" w:eastAsia="Times New Roman" w:hAnsi="Times New Roman" w:cs="Times New Roman"/>
-          <w:sz w:val="28"/>
-          <w:szCs w:val="28"/>
-          <w:lang w:eastAsia="ru-RU"/>
-        </w:rPr>
-        <w:t>т клиенту время приёма в офисе.</w:t>
+        <w:t>Назначить время приёма – сотрудник назначает клиенту время приёма в офисе.</w:t>
       </w:r>
     </w:p>
     <w:p>
@@ -6255,16 +5675,7 @@
           <w:szCs w:val="28"/>
           <w:lang w:eastAsia="ru-RU"/>
         </w:rPr>
-        <w:t>Добавить комментарий – сотрудник оставл</w:t>
-      </w:r>
-      <w:r>
-        <w:rPr>
-          <w:rFonts w:ascii="Times New Roman" w:eastAsia="Times New Roman" w:hAnsi="Times New Roman" w:cs="Times New Roman"/>
-          <w:sz w:val="28"/>
-          <w:szCs w:val="28"/>
-          <w:lang w:eastAsia="ru-RU"/>
-        </w:rPr>
-        <w:t>яет комментарий к любой заявке.</w:t>
+        <w:t>Добавить комментарий – сотрудник оставляет комментарий к любой заявке.</w:t>
       </w:r>
     </w:p>
     <w:p>
@@ -6291,16 +5702,7 @@
           <w:szCs w:val="28"/>
           <w:lang w:eastAsia="ru-RU"/>
         </w:rPr>
-        <w:t>Ответить на обращение в чате поддержки – сот</w:t>
-      </w:r>
-      <w:r>
-        <w:rPr>
-          <w:rFonts w:ascii="Times New Roman" w:eastAsia="Times New Roman" w:hAnsi="Times New Roman" w:cs="Times New Roman"/>
-          <w:sz w:val="28"/>
-          <w:szCs w:val="28"/>
-          <w:lang w:eastAsia="ru-RU"/>
-        </w:rPr>
-        <w:t>рудник отвечает клиенту в чате.</w:t>
+        <w:t>Ответить на обращение в чате поддержки – сотрудник отвечает клиенту в чате.</w:t>
       </w:r>
     </w:p>
     <w:p>
@@ -6327,16 +5729,7 @@
           <w:szCs w:val="28"/>
           <w:lang w:eastAsia="ru-RU"/>
         </w:rPr>
-        <w:t>Просмотр всех чатов – сотрудник видит спи</w:t>
-      </w:r>
-      <w:r>
-        <w:rPr>
-          <w:rFonts w:ascii="Times New Roman" w:eastAsia="Times New Roman" w:hAnsi="Times New Roman" w:cs="Times New Roman"/>
-          <w:sz w:val="28"/>
-          <w:szCs w:val="28"/>
-          <w:lang w:eastAsia="ru-RU"/>
-        </w:rPr>
-        <w:t>сок активных чатов с клиентами.</w:t>
+        <w:t>Просмотр всех чатов – сотрудник видит список активных чатов с клиентами.</w:t>
       </w:r>
     </w:p>
     <w:p>
@@ -6363,16 +5756,7 @@
           <w:szCs w:val="28"/>
           <w:lang w:eastAsia="ru-RU"/>
         </w:rPr>
-        <w:t>Управление данными пользователей – администратор управляет пользовате</w:t>
-      </w:r>
-      <w:r>
-        <w:rPr>
-          <w:rFonts w:ascii="Times New Roman" w:eastAsia="Times New Roman" w:hAnsi="Times New Roman" w:cs="Times New Roman"/>
-          <w:sz w:val="28"/>
-          <w:szCs w:val="28"/>
-          <w:lang w:eastAsia="ru-RU"/>
-        </w:rPr>
-        <w:t>лями (блокировка, смена ролей).</w:t>
+        <w:t>Управление данными пользователей – администратор управляет пользователями (блокировка, смена ролей).</w:t>
       </w:r>
     </w:p>
     <w:p>
@@ -6399,36 +5783,7 @@
           <w:szCs w:val="28"/>
           <w:lang w:eastAsia="ru-RU"/>
         </w:rPr>
-        <w:t xml:space="preserve">Импорт/экспорт данных в </w:t>
-      </w:r>
-      <w:proofErr w:type="spellStart"/>
-      <w:r>
-        <w:rPr>
-          <w:rFonts w:ascii="Times New Roman" w:eastAsia="Times New Roman" w:hAnsi="Times New Roman" w:cs="Times New Roman"/>
-          <w:sz w:val="28"/>
-          <w:szCs w:val="28"/>
-          <w:lang w:eastAsia="ru-RU"/>
-        </w:rPr>
-        <w:t>Excel</w:t>
-      </w:r>
-      <w:proofErr w:type="spellEnd"/>
-      <w:r>
-        <w:rPr>
-          <w:rFonts w:ascii="Times New Roman" w:eastAsia="Times New Roman" w:hAnsi="Times New Roman" w:cs="Times New Roman"/>
-          <w:sz w:val="28"/>
-          <w:szCs w:val="28"/>
-          <w:lang w:eastAsia="ru-RU"/>
-        </w:rPr>
-        <w:t xml:space="preserve"> – администратор импортирует </w:t>
-      </w:r>
-      <w:r>
-        <w:rPr>
-          <w:rFonts w:ascii="Times New Roman" w:eastAsia="Times New Roman" w:hAnsi="Times New Roman" w:cs="Times New Roman"/>
-          <w:sz w:val="28"/>
-          <w:szCs w:val="28"/>
-          <w:lang w:eastAsia="ru-RU"/>
-        </w:rPr>
-        <w:t>или экспортирует данные заявок.</w:t>
+        <w:t>Импорт/экспорт данных в Excel – администратор импортирует или экспортирует данные заявок.</w:t>
       </w:r>
     </w:p>
     <w:p>
@@ -6455,16 +5810,7 @@
           <w:szCs w:val="28"/>
           <w:lang w:eastAsia="ru-RU"/>
         </w:rPr>
-        <w:t>Генерация отчётов / аналитика – администратор форм</w:t>
-      </w:r>
-      <w:r>
-        <w:rPr>
-          <w:rFonts w:ascii="Times New Roman" w:eastAsia="Times New Roman" w:hAnsi="Times New Roman" w:cs="Times New Roman"/>
-          <w:sz w:val="28"/>
-          <w:szCs w:val="28"/>
-          <w:lang w:eastAsia="ru-RU"/>
-        </w:rPr>
-        <w:t>ирует отчёты по работе системы.</w:t>
+        <w:t>Генерация отчётов / аналитика – администратор формирует отчёты по работе системы.</w:t>
       </w:r>
     </w:p>
     <w:p>
@@ -6491,16 +5837,7 @@
           <w:szCs w:val="28"/>
           <w:lang w:eastAsia="ru-RU"/>
         </w:rPr>
-        <w:t>Скачать договор по любой заявке (PDF) – сотрудник скач</w:t>
-      </w:r>
-      <w:r>
-        <w:rPr>
-          <w:rFonts w:ascii="Times New Roman" w:eastAsia="Times New Roman" w:hAnsi="Times New Roman" w:cs="Times New Roman"/>
-          <w:sz w:val="28"/>
-          <w:szCs w:val="28"/>
-          <w:lang w:eastAsia="ru-RU"/>
-        </w:rPr>
-        <w:t>ивает договор для любой заявки.</w:t>
+        <w:t>Скачать договор по любой заявке (PDF) – сотрудник скачивает договор для любой заявки.</w:t>
       </w:r>
     </w:p>
     <w:p>
@@ -6570,27 +5907,7 @@
           <w:lang w:eastAsia="ru-RU"/>
         </w:rPr>
         <w:lastRenderedPageBreak/>
-        <w:t xml:space="preserve">Клиент: Регистрация, Вход в систему, </w:t>
-      </w:r>
-      <w:proofErr w:type="gramStart"/>
-      <w:r>
-        <w:rPr>
-          <w:rFonts w:ascii="Times New Roman" w:eastAsia="Times New Roman" w:hAnsi="Times New Roman" w:cs="Times New Roman"/>
-          <w:sz w:val="28"/>
-          <w:szCs w:val="28"/>
-          <w:lang w:eastAsia="ru-RU"/>
-        </w:rPr>
-        <w:t>Создать</w:t>
-      </w:r>
-      <w:proofErr w:type="gramEnd"/>
-      <w:r>
-        <w:rPr>
-          <w:rFonts w:ascii="Times New Roman" w:eastAsia="Times New Roman" w:hAnsi="Times New Roman" w:cs="Times New Roman"/>
-          <w:sz w:val="28"/>
-          <w:szCs w:val="28"/>
-          <w:lang w:eastAsia="ru-RU"/>
-        </w:rPr>
-        <w:t xml:space="preserve"> заявку, Просмотр всех заявок, Добавить комментарий к заявке, Обращение в чат поддержки, Отправить сообщение в чат, </w:t>
+        <w:t xml:space="preserve">Клиент: Регистрация, Вход в систему, Создать заявку, Просмотр всех заявок, Добавить комментарий к заявке, Обращение в чат поддержки, Отправить сообщение в чат, </w:t>
       </w:r>
       <w:r>
         <w:rPr>
@@ -6622,47 +5939,7 @@
           <w:szCs w:val="28"/>
           <w:lang w:eastAsia="ru-RU"/>
         </w:rPr>
-        <w:t xml:space="preserve">Сотрудник / Администратор: Вход в систему как сотрудник/администратор, Просмотр всех заявок, Фильтрация, Изменения данных заявок, Изменение статуса, </w:t>
-      </w:r>
-      <w:proofErr w:type="gramStart"/>
-      <w:r>
-        <w:rPr>
-          <w:rFonts w:ascii="Times New Roman" w:eastAsia="Times New Roman" w:hAnsi="Times New Roman" w:cs="Times New Roman"/>
-          <w:sz w:val="28"/>
-          <w:szCs w:val="28"/>
-          <w:lang w:eastAsia="ru-RU"/>
-        </w:rPr>
-        <w:t>Назначить</w:t>
-      </w:r>
-      <w:proofErr w:type="gramEnd"/>
-      <w:r>
-        <w:rPr>
-          <w:rFonts w:ascii="Times New Roman" w:eastAsia="Times New Roman" w:hAnsi="Times New Roman" w:cs="Times New Roman"/>
-          <w:sz w:val="28"/>
-          <w:szCs w:val="28"/>
-          <w:lang w:eastAsia="ru-RU"/>
-        </w:rPr>
-        <w:t xml:space="preserve"> время приёма, Добавить комментарий, Ответить на обращение в чате поддержки, Просмотр всех чатов, Управление данными пользователей, Импорт/экспорт данных в </w:t>
-      </w:r>
-      <w:proofErr w:type="spellStart"/>
-      <w:r>
-        <w:rPr>
-          <w:rFonts w:ascii="Times New Roman" w:eastAsia="Times New Roman" w:hAnsi="Times New Roman" w:cs="Times New Roman"/>
-          <w:sz w:val="28"/>
-          <w:szCs w:val="28"/>
-          <w:lang w:eastAsia="ru-RU"/>
-        </w:rPr>
-        <w:t>Excel</w:t>
-      </w:r>
-      <w:proofErr w:type="spellEnd"/>
-      <w:r>
-        <w:rPr>
-          <w:rFonts w:ascii="Times New Roman" w:eastAsia="Times New Roman" w:hAnsi="Times New Roman" w:cs="Times New Roman"/>
-          <w:sz w:val="28"/>
-          <w:szCs w:val="28"/>
-          <w:lang w:eastAsia="ru-RU"/>
-        </w:rPr>
-        <w:t>, Генерация отчётов / аналитика, Скачат</w:t>
+        <w:t>Сотрудник / Администратор: Вход в систему как сотрудник/администратор, Просмотр всех заявок, Фильтрация, Изменения данных заявок, Изменение статуса, Назначить время приёма, Добавить комментарий, Ответить на обращение в чате поддержки, Просмотр всех чатов, Управление данными пользователей, Импорт/экспорт данных в Excel, Генерация отчётов / аналитика, Скачат</w:t>
       </w:r>
       <w:r>
         <w:rPr>
@@ -6694,27 +5971,7 @@
           <w:szCs w:val="28"/>
           <w:lang w:eastAsia="ru-RU"/>
         </w:rPr>
-        <w:t>2. Отношения включения (&lt;&lt;</w:t>
-      </w:r>
-      <w:proofErr w:type="spellStart"/>
-      <w:r>
-        <w:rPr>
-          <w:rFonts w:ascii="Times New Roman" w:eastAsia="Times New Roman" w:hAnsi="Times New Roman" w:cs="Times New Roman"/>
-          <w:sz w:val="28"/>
-          <w:szCs w:val="28"/>
-          <w:lang w:eastAsia="ru-RU"/>
-        </w:rPr>
-        <w:t>include</w:t>
-      </w:r>
-      <w:proofErr w:type="spellEnd"/>
-      <w:r>
-        <w:rPr>
-          <w:rFonts w:ascii="Times New Roman" w:eastAsia="Times New Roman" w:hAnsi="Times New Roman" w:cs="Times New Roman"/>
-          <w:sz w:val="28"/>
-          <w:szCs w:val="28"/>
-          <w:lang w:eastAsia="ru-RU"/>
-        </w:rPr>
-        <w:t>&gt;&gt;):</w:t>
+        <w:t>2. Отношения включения (&lt;&lt;include&gt;&gt;):</w:t>
       </w:r>
     </w:p>
     <w:p>
@@ -6741,16 +5998,7 @@
           <w:szCs w:val="28"/>
           <w:lang w:eastAsia="ru-RU"/>
         </w:rPr>
-        <w:t>Чтобы создать заявку, не</w:t>
-      </w:r>
-      <w:r>
-        <w:rPr>
-          <w:rFonts w:ascii="Times New Roman" w:eastAsia="Times New Roman" w:hAnsi="Times New Roman" w:cs="Times New Roman"/>
-          <w:sz w:val="28"/>
-          <w:szCs w:val="28"/>
-          <w:lang w:eastAsia="ru-RU"/>
-        </w:rPr>
-        <w:t>обходимо внести данные компании</w:t>
+        <w:t>Чтобы создать заявку, необходимо внести данные компании</w:t>
       </w:r>
     </w:p>
     <w:p>
@@ -6777,16 +6025,7 @@
           <w:szCs w:val="28"/>
           <w:lang w:eastAsia="ru-RU"/>
         </w:rPr>
-        <w:t>Чтобы создать заявку, необхо</w:t>
-      </w:r>
-      <w:r>
-        <w:rPr>
-          <w:rFonts w:ascii="Times New Roman" w:eastAsia="Times New Roman" w:hAnsi="Times New Roman" w:cs="Times New Roman"/>
-          <w:sz w:val="28"/>
-          <w:szCs w:val="28"/>
-          <w:lang w:eastAsia="ru-RU"/>
-        </w:rPr>
-        <w:t>димо оставить контактные данные</w:t>
+        <w:t>Чтобы создать заявку, необходимо оставить контактные данные</w:t>
       </w:r>
     </w:p>
     <w:p>
@@ -6813,16 +6052,7 @@
           <w:szCs w:val="28"/>
           <w:lang w:eastAsia="ru-RU"/>
         </w:rPr>
-        <w:t>Чтобы создать заявку, можн</w:t>
-      </w:r>
-      <w:r>
-        <w:rPr>
-          <w:rFonts w:ascii="Times New Roman" w:eastAsia="Times New Roman" w:hAnsi="Times New Roman" w:cs="Times New Roman"/>
-          <w:sz w:val="28"/>
-          <w:szCs w:val="28"/>
-          <w:lang w:eastAsia="ru-RU"/>
-        </w:rPr>
-        <w:t>о добавить комментарий к заявке</w:t>
+        <w:t>Чтобы создать заявку, можно добавить комментарий к заявке</w:t>
       </w:r>
     </w:p>
     <w:p>
@@ -6849,16 +6079,7 @@
           <w:szCs w:val="28"/>
           <w:lang w:eastAsia="ru-RU"/>
         </w:rPr>
-        <w:t>Чтобы обратиться в чат поддержки, необх</w:t>
-      </w:r>
-      <w:r>
-        <w:rPr>
-          <w:rFonts w:ascii="Times New Roman" w:eastAsia="Times New Roman" w:hAnsi="Times New Roman" w:cs="Times New Roman"/>
-          <w:sz w:val="28"/>
-          <w:szCs w:val="28"/>
-          <w:lang w:eastAsia="ru-RU"/>
-        </w:rPr>
-        <w:t>одимо отправить сообщение в чат</w:t>
+        <w:t>Чтобы обратиться в чат поддержки, необходимо отправить сообщение в чат</w:t>
       </w:r>
     </w:p>
     <w:p>
@@ -6885,16 +6106,7 @@
           <w:szCs w:val="28"/>
           <w:lang w:eastAsia="ru-RU"/>
         </w:rPr>
-        <w:t xml:space="preserve">Чтобы сгенерировать отчёт, </w:t>
-      </w:r>
-      <w:r>
-        <w:rPr>
-          <w:rFonts w:ascii="Times New Roman" w:eastAsia="Times New Roman" w:hAnsi="Times New Roman" w:cs="Times New Roman"/>
-          <w:sz w:val="28"/>
-          <w:szCs w:val="28"/>
-          <w:lang w:eastAsia="ru-RU"/>
-        </w:rPr>
-        <w:t>необходимо выполнить фильтрацию</w:t>
+        <w:t>Чтобы сгенерировать отчёт, необходимо выполнить фильтрацию</w:t>
       </w:r>
     </w:p>
     <w:p>
@@ -6921,16 +6133,7 @@
           <w:szCs w:val="28"/>
           <w:lang w:eastAsia="ru-RU"/>
         </w:rPr>
-        <w:t>Чтобы выполнить фильтрацию, не</w:t>
-      </w:r>
-      <w:r>
-        <w:rPr>
-          <w:rFonts w:ascii="Times New Roman" w:eastAsia="Times New Roman" w:hAnsi="Times New Roman" w:cs="Times New Roman"/>
-          <w:sz w:val="28"/>
-          <w:szCs w:val="28"/>
-          <w:lang w:eastAsia="ru-RU"/>
-        </w:rPr>
-        <w:t>обходимо просмотреть все заявки</w:t>
+        <w:t>Чтобы выполнить фильтрацию, необходимо просмотреть все заявки</w:t>
       </w:r>
     </w:p>
     <w:p>
@@ -6953,27 +6156,7 @@
           <w:szCs w:val="28"/>
           <w:lang w:eastAsia="ru-RU"/>
         </w:rPr>
-        <w:t>3. Отношения расширения (&lt;&lt;</w:t>
-      </w:r>
-      <w:proofErr w:type="spellStart"/>
-      <w:r>
-        <w:rPr>
-          <w:rFonts w:ascii="Times New Roman" w:eastAsia="Times New Roman" w:hAnsi="Times New Roman" w:cs="Times New Roman"/>
-          <w:sz w:val="28"/>
-          <w:szCs w:val="28"/>
-          <w:lang w:eastAsia="ru-RU"/>
-        </w:rPr>
-        <w:t>extend</w:t>
-      </w:r>
-      <w:proofErr w:type="spellEnd"/>
-      <w:r>
-        <w:rPr>
-          <w:rFonts w:ascii="Times New Roman" w:eastAsia="Times New Roman" w:hAnsi="Times New Roman" w:cs="Times New Roman"/>
-          <w:sz w:val="28"/>
-          <w:szCs w:val="28"/>
-          <w:lang w:eastAsia="ru-RU"/>
-        </w:rPr>
-        <w:t>&gt;&gt;):</w:t>
+        <w:t>3. Отношения расширения (&lt;&lt;extend&gt;&gt;):</w:t>
       </w:r>
     </w:p>
     <w:p>
@@ -7000,16 +6183,7 @@
           <w:szCs w:val="28"/>
           <w:lang w:eastAsia="ru-RU"/>
         </w:rPr>
-        <w:t>При изменении статуса заявки можно допол</w:t>
-      </w:r>
-      <w:r>
-        <w:rPr>
-          <w:rFonts w:ascii="Times New Roman" w:eastAsia="Times New Roman" w:hAnsi="Times New Roman" w:cs="Times New Roman"/>
-          <w:sz w:val="28"/>
-          <w:szCs w:val="28"/>
-          <w:lang w:eastAsia="ru-RU"/>
-        </w:rPr>
-        <w:t>нительно назначить время приёма</w:t>
+        <w:t>При изменении статуса заявки можно дополнительно назначить время приёма</w:t>
       </w:r>
     </w:p>
     <w:p>
@@ -7036,28 +6210,8 @@
           <w:szCs w:val="28"/>
           <w:lang w:eastAsia="ru-RU"/>
         </w:rPr>
-        <w:t>При просмотре всех заявок</w:t>
-      </w:r>
-      <w:r>
-        <w:rPr>
-          <w:rFonts w:ascii="Times New Roman" w:eastAsia="Times New Roman" w:hAnsi="Times New Roman" w:cs="Times New Roman"/>
-          <w:sz w:val="28"/>
-          <w:szCs w:val="28"/>
-          <w:lang w:eastAsia="ru-RU"/>
-        </w:rPr>
-        <w:t xml:space="preserve"> можно выгрузить данные в </w:t>
-      </w:r>
-      <w:proofErr w:type="spellStart"/>
-      <w:r>
-        <w:rPr>
-          <w:rFonts w:ascii="Times New Roman" w:eastAsia="Times New Roman" w:hAnsi="Times New Roman" w:cs="Times New Roman"/>
-          <w:sz w:val="28"/>
-          <w:szCs w:val="28"/>
-          <w:lang w:eastAsia="ru-RU"/>
-        </w:rPr>
-        <w:t>Excel</w:t>
-      </w:r>
-      <w:proofErr w:type="spellEnd"/>
+        <w:t>При просмотре всех заявок можно выгрузить данные в Excel</w:t>
+      </w:r>
     </w:p>
     <w:p>
       <w:pPr>
@@ -7083,16 +6237,7 @@
           <w:szCs w:val="28"/>
           <w:lang w:eastAsia="ru-RU"/>
         </w:rPr>
-        <w:t xml:space="preserve">При просмотре всех заявок можно </w:t>
-      </w:r>
-      <w:r>
-        <w:rPr>
-          <w:rFonts w:ascii="Times New Roman" w:eastAsia="Times New Roman" w:hAnsi="Times New Roman" w:cs="Times New Roman"/>
-          <w:sz w:val="28"/>
-          <w:szCs w:val="28"/>
-          <w:lang w:eastAsia="ru-RU"/>
-        </w:rPr>
-        <w:t>скачать договор по любой заявке</w:t>
+        <w:t>При просмотре всех заявок можно скачать договор по любой заявке</w:t>
       </w:r>
     </w:p>
     <w:p>
@@ -7137,6 +6282,7 @@
       <w:r>
         <w:rPr>
           <w:rFonts w:ascii="Times New Roman" w:eastAsia="Times New Roman" w:hAnsi="Times New Roman" w:cs="Times New Roman"/>
+          <w:noProof/>
           <w:sz w:val="28"/>
           <w:szCs w:val="28"/>
           <w:lang w:eastAsia="ru-RU"/>
@@ -7200,8 +6346,44 @@
         </w:rPr>
         <w:t>Рисунок 1 – Диаграмма использования.</w:t>
       </w:r>
-      <w:bookmarkStart w:id="9" w:name="_GoBack"/>
-      <w:bookmarkEnd w:id="9"/>
+    </w:p>
+    <w:p>
+      <w:pPr>
+        <w:pStyle w:val="2"/>
+        <w:rPr>
+          <w:rFonts w:eastAsia="Times New Roman" w:cs="Times New Roman"/>
+          <w:szCs w:val="28"/>
+          <w:lang w:eastAsia="ru-RU"/>
+        </w:rPr>
+      </w:pPr>
+      <w:r>
+        <w:rPr>
+          <w:rFonts w:eastAsia="Times New Roman" w:cs="Times New Roman"/>
+          <w:bCs/>
+          <w:szCs w:val="28"/>
+          <w:lang w:eastAsia="ru-RU"/>
+        </w:rPr>
+        <w:t>3.</w:t>
+      </w:r>
+      <w:r>
+        <w:rPr>
+          <w:rFonts w:eastAsia="Times New Roman" w:cs="Times New Roman"/>
+          <w:b w:val="0"/>
+          <w:bCs/>
+          <w:szCs w:val="28"/>
+          <w:lang w:eastAsia="ru-RU"/>
+        </w:rPr>
+        <w:t>2</w:t>
+      </w:r>
+      <w:r>
+        <w:rPr>
+          <w:rFonts w:eastAsia="Times New Roman" w:cs="Times New Roman"/>
+          <w:bCs/>
+          <w:szCs w:val="28"/>
+          <w:lang w:eastAsia="ru-RU"/>
+        </w:rPr>
+        <w:t>. Диаграмма компонентов</w:t>
+      </w:r>
     </w:p>
     <w:p>
       <w:pPr>
@@ -7216,6 +6398,522 @@
           <w:lang w:eastAsia="ru-RU"/>
         </w:rPr>
       </w:pPr>
+      <w:r>
+        <w:rPr>
+          <w:rFonts w:ascii="Times New Roman" w:eastAsia="Times New Roman" w:hAnsi="Times New Roman" w:cs="Times New Roman"/>
+          <w:sz w:val="28"/>
+          <w:szCs w:val="28"/>
+          <w:lang w:eastAsia="ru-RU"/>
+        </w:rPr>
+        <w:t>Диаграмма компонентов отражает логическую структуру программного обеспечения системы «ITRexHelper» и показывает, из каких основных частей состоит программа и как они связаны между собой.</w:t>
+      </w:r>
+    </w:p>
+    <w:p>
+      <w:pPr>
+        <w:spacing w:after="0" w:line="360" w:lineRule="auto"/>
+        <w:ind w:firstLine="851"/>
+        <w:contextualSpacing/>
+        <w:jc w:val="both"/>
+        <w:rPr>
+          <w:rFonts w:ascii="Times New Roman" w:eastAsia="Times New Roman" w:hAnsi="Times New Roman" w:cs="Times New Roman"/>
+          <w:sz w:val="28"/>
+          <w:szCs w:val="28"/>
+          <w:lang w:eastAsia="ru-RU"/>
+        </w:rPr>
+      </w:pPr>
+      <w:r>
+        <w:rPr>
+          <w:rFonts w:ascii="Times New Roman" w:eastAsia="Times New Roman" w:hAnsi="Times New Roman" w:cs="Times New Roman"/>
+          <w:b/>
+          <w:bCs/>
+          <w:sz w:val="28"/>
+          <w:szCs w:val="28"/>
+          <w:lang w:eastAsia="ru-RU"/>
+        </w:rPr>
+        <w:t>Основные компоненты системы:</w:t>
+      </w:r>
+    </w:p>
+    <w:p>
+      <w:pPr>
+        <w:numPr>
+          <w:ilvl w:val="0"/>
+          <w:numId w:val="18"/>
+        </w:numPr>
+        <w:spacing w:after="0" w:line="360" w:lineRule="auto"/>
+        <w:ind w:left="0" w:firstLine="851"/>
+        <w:contextualSpacing/>
+        <w:jc w:val="both"/>
+        <w:rPr>
+          <w:rFonts w:ascii="Times New Roman" w:eastAsia="Times New Roman" w:hAnsi="Times New Roman" w:cs="Times New Roman"/>
+          <w:sz w:val="28"/>
+          <w:szCs w:val="28"/>
+          <w:lang w:eastAsia="ru-RU"/>
+        </w:rPr>
+      </w:pPr>
+      <w:r>
+        <w:rPr>
+          <w:rFonts w:ascii="Times New Roman" w:eastAsia="Times New Roman" w:hAnsi="Times New Roman" w:cs="Times New Roman"/>
+          <w:b/>
+          <w:bCs/>
+          <w:sz w:val="28"/>
+          <w:szCs w:val="28"/>
+          <w:lang w:eastAsia="ru-RU"/>
+        </w:rPr>
+        <w:t>Веб-интерфейс (Клиентская часть)</w:t>
+      </w:r>
+      <w:r>
+        <w:rPr>
+          <w:rFonts w:ascii="Times New Roman" w:eastAsia="Times New Roman" w:hAnsi="Times New Roman" w:cs="Times New Roman"/>
+          <w:sz w:val="28"/>
+          <w:szCs w:val="28"/>
+          <w:lang w:eastAsia="ru-RU"/>
+        </w:rPr>
+        <w:t xml:space="preserve"> </w:t>
+      </w:r>
+      <w:r>
+        <w:rPr>
+          <w:rFonts w:ascii="Times New Roman" w:eastAsia="Times New Roman" w:hAnsi="Times New Roman" w:cs="Times New Roman"/>
+          <w:sz w:val="28"/>
+          <w:szCs w:val="28"/>
+          <w:lang w:eastAsia="ru-RU"/>
+        </w:rPr>
+        <w:t>-</w:t>
+      </w:r>
+      <w:r>
+        <w:rPr>
+          <w:rFonts w:ascii="Times New Roman" w:eastAsia="Times New Roman" w:hAnsi="Times New Roman" w:cs="Times New Roman"/>
+          <w:sz w:val="28"/>
+          <w:szCs w:val="28"/>
+          <w:lang w:eastAsia="ru-RU"/>
+        </w:rPr>
+        <w:t xml:space="preserve"> страницы сайта, с которыми работают клиенты и сотрудники: формы входа, списки заявок, чат поддержки и админ-панель.</w:t>
+      </w:r>
+    </w:p>
+    <w:p>
+      <w:pPr>
+        <w:numPr>
+          <w:ilvl w:val="0"/>
+          <w:numId w:val="18"/>
+        </w:numPr>
+        <w:spacing w:after="0" w:line="360" w:lineRule="auto"/>
+        <w:ind w:left="0" w:firstLine="851"/>
+        <w:contextualSpacing/>
+        <w:jc w:val="both"/>
+        <w:rPr>
+          <w:rFonts w:ascii="Times New Roman" w:eastAsia="Times New Roman" w:hAnsi="Times New Roman" w:cs="Times New Roman"/>
+          <w:sz w:val="28"/>
+          <w:szCs w:val="28"/>
+          <w:lang w:eastAsia="ru-RU"/>
+        </w:rPr>
+      </w:pPr>
+      <w:r>
+        <w:rPr>
+          <w:rFonts w:ascii="Times New Roman" w:eastAsia="Times New Roman" w:hAnsi="Times New Roman" w:cs="Times New Roman"/>
+          <w:b/>
+          <w:bCs/>
+          <w:sz w:val="28"/>
+          <w:szCs w:val="28"/>
+          <w:lang w:eastAsia="ru-RU"/>
+        </w:rPr>
+        <w:t>Модуль</w:t>
+      </w:r>
+      <w:r>
+        <w:rPr>
+          <w:rFonts w:ascii="Times New Roman" w:eastAsia="Times New Roman" w:hAnsi="Times New Roman" w:cs="Times New Roman"/>
+          <w:b/>
+          <w:bCs/>
+          <w:sz w:val="28"/>
+          <w:szCs w:val="28"/>
+          <w:lang w:eastAsia="ru-RU"/>
+        </w:rPr>
+        <w:t xml:space="preserve"> регистрации</w:t>
+      </w:r>
+      <w:r>
+        <w:rPr>
+          <w:rFonts w:ascii="Times New Roman" w:eastAsia="Times New Roman" w:hAnsi="Times New Roman" w:cs="Times New Roman"/>
+          <w:b/>
+          <w:bCs/>
+          <w:sz w:val="28"/>
+          <w:szCs w:val="28"/>
+          <w:lang w:eastAsia="ru-RU"/>
+        </w:rPr>
+        <w:t xml:space="preserve"> и </w:t>
+      </w:r>
+      <w:r>
+        <w:rPr>
+          <w:rFonts w:ascii="Times New Roman" w:eastAsia="Times New Roman" w:hAnsi="Times New Roman" w:cs="Times New Roman"/>
+          <w:b/>
+          <w:bCs/>
+          <w:sz w:val="28"/>
+          <w:szCs w:val="28"/>
+          <w:lang w:eastAsia="ru-RU"/>
+        </w:rPr>
+        <w:t>аутентификации</w:t>
+      </w:r>
+      <w:r>
+        <w:rPr>
+          <w:rFonts w:ascii="Times New Roman" w:eastAsia="Times New Roman" w:hAnsi="Times New Roman" w:cs="Times New Roman"/>
+          <w:sz w:val="28"/>
+          <w:szCs w:val="28"/>
+          <w:lang w:eastAsia="ru-RU"/>
+        </w:rPr>
+        <w:t xml:space="preserve"> </w:t>
+      </w:r>
+      <w:r>
+        <w:rPr>
+          <w:rFonts w:ascii="Times New Roman" w:eastAsia="Times New Roman" w:hAnsi="Times New Roman" w:cs="Times New Roman"/>
+          <w:sz w:val="28"/>
+          <w:szCs w:val="28"/>
+          <w:lang w:eastAsia="ru-RU"/>
+        </w:rPr>
+        <w:t>-</w:t>
+      </w:r>
+      <w:r>
+        <w:rPr>
+          <w:rFonts w:ascii="Times New Roman" w:eastAsia="Times New Roman" w:hAnsi="Times New Roman" w:cs="Times New Roman"/>
+          <w:sz w:val="28"/>
+          <w:szCs w:val="28"/>
+          <w:lang w:eastAsia="ru-RU"/>
+        </w:rPr>
+        <w:t xml:space="preserve"> проверяет пароль пользователя при входе, регистрирует новых клиентов и восстанавливает забытые пароли.</w:t>
+      </w:r>
+    </w:p>
+    <w:p>
+      <w:pPr>
+        <w:numPr>
+          <w:ilvl w:val="0"/>
+          <w:numId w:val="18"/>
+        </w:numPr>
+        <w:spacing w:after="0" w:line="360" w:lineRule="auto"/>
+        <w:ind w:left="0" w:firstLine="851"/>
+        <w:contextualSpacing/>
+        <w:jc w:val="both"/>
+        <w:rPr>
+          <w:rFonts w:ascii="Times New Roman" w:eastAsia="Times New Roman" w:hAnsi="Times New Roman" w:cs="Times New Roman"/>
+          <w:sz w:val="28"/>
+          <w:szCs w:val="28"/>
+          <w:lang w:eastAsia="ru-RU"/>
+        </w:rPr>
+      </w:pPr>
+      <w:r>
+        <w:rPr>
+          <w:rFonts w:ascii="Times New Roman" w:eastAsia="Times New Roman" w:hAnsi="Times New Roman" w:cs="Times New Roman"/>
+          <w:b/>
+          <w:bCs/>
+          <w:sz w:val="28"/>
+          <w:szCs w:val="28"/>
+          <w:lang w:eastAsia="ru-RU"/>
+        </w:rPr>
+        <w:t>Модуль заявок</w:t>
+      </w:r>
+      <w:r>
+        <w:rPr>
+          <w:rFonts w:ascii="Times New Roman" w:eastAsia="Times New Roman" w:hAnsi="Times New Roman" w:cs="Times New Roman"/>
+          <w:sz w:val="28"/>
+          <w:szCs w:val="28"/>
+          <w:lang w:eastAsia="ru-RU"/>
+        </w:rPr>
+        <w:t xml:space="preserve"> </w:t>
+      </w:r>
+      <w:r>
+        <w:rPr>
+          <w:rFonts w:ascii="Times New Roman" w:eastAsia="Times New Roman" w:hAnsi="Times New Roman" w:cs="Times New Roman"/>
+          <w:sz w:val="28"/>
+          <w:szCs w:val="28"/>
+          <w:lang w:eastAsia="ru-RU"/>
+        </w:rPr>
+        <w:t>-</w:t>
+      </w:r>
+      <w:r>
+        <w:rPr>
+          <w:rFonts w:ascii="Times New Roman" w:eastAsia="Times New Roman" w:hAnsi="Times New Roman" w:cs="Times New Roman"/>
+          <w:sz w:val="28"/>
+          <w:szCs w:val="28"/>
+          <w:lang w:eastAsia="ru-RU"/>
+        </w:rPr>
+        <w:t xml:space="preserve"> центральный компонент системы. Принимает новые заявки, позволяет сотрудникам менять их статусы, назначать исполнителей и расставлять приоритеты.</w:t>
+      </w:r>
+    </w:p>
+    <w:p>
+      <w:pPr>
+        <w:numPr>
+          <w:ilvl w:val="0"/>
+          <w:numId w:val="18"/>
+        </w:numPr>
+        <w:spacing w:after="0" w:line="360" w:lineRule="auto"/>
+        <w:ind w:left="0" w:firstLine="851"/>
+        <w:contextualSpacing/>
+        <w:jc w:val="both"/>
+        <w:rPr>
+          <w:rFonts w:ascii="Times New Roman" w:eastAsia="Times New Roman" w:hAnsi="Times New Roman" w:cs="Times New Roman"/>
+          <w:sz w:val="28"/>
+          <w:szCs w:val="28"/>
+          <w:lang w:eastAsia="ru-RU"/>
+        </w:rPr>
+      </w:pPr>
+      <w:r>
+        <w:rPr>
+          <w:rFonts w:ascii="Times New Roman" w:eastAsia="Times New Roman" w:hAnsi="Times New Roman" w:cs="Times New Roman"/>
+          <w:b/>
+          <w:bCs/>
+          <w:sz w:val="28"/>
+          <w:szCs w:val="28"/>
+          <w:lang w:eastAsia="ru-RU"/>
+        </w:rPr>
+        <w:lastRenderedPageBreak/>
+        <w:t>Модуль чата и уведомлений</w:t>
+      </w:r>
+      <w:r>
+        <w:rPr>
+          <w:rFonts w:ascii="Times New Roman" w:eastAsia="Times New Roman" w:hAnsi="Times New Roman" w:cs="Times New Roman"/>
+          <w:sz w:val="28"/>
+          <w:szCs w:val="28"/>
+          <w:lang w:eastAsia="ru-RU"/>
+        </w:rPr>
+        <w:t xml:space="preserve"> </w:t>
+      </w:r>
+      <w:r>
+        <w:rPr>
+          <w:rFonts w:ascii="Times New Roman" w:eastAsia="Times New Roman" w:hAnsi="Times New Roman" w:cs="Times New Roman"/>
+          <w:sz w:val="28"/>
+          <w:szCs w:val="28"/>
+          <w:lang w:eastAsia="ru-RU"/>
+        </w:rPr>
+        <w:t>-</w:t>
+      </w:r>
+      <w:r>
+        <w:rPr>
+          <w:rFonts w:ascii="Times New Roman" w:eastAsia="Times New Roman" w:hAnsi="Times New Roman" w:cs="Times New Roman"/>
+          <w:sz w:val="28"/>
+          <w:szCs w:val="28"/>
+          <w:lang w:eastAsia="ru-RU"/>
+        </w:rPr>
+        <w:t xml:space="preserve"> обеспечивает работу чата поддержки в реальном времени и отправляет уведомления пользователям о новых комментариях.</w:t>
+      </w:r>
+    </w:p>
+    <w:p>
+      <w:pPr>
+        <w:numPr>
+          <w:ilvl w:val="0"/>
+          <w:numId w:val="18"/>
+        </w:numPr>
+        <w:spacing w:after="0" w:line="360" w:lineRule="auto"/>
+        <w:ind w:left="0" w:firstLine="851"/>
+        <w:contextualSpacing/>
+        <w:jc w:val="both"/>
+        <w:rPr>
+          <w:rFonts w:ascii="Times New Roman" w:eastAsia="Times New Roman" w:hAnsi="Times New Roman" w:cs="Times New Roman"/>
+          <w:sz w:val="28"/>
+          <w:szCs w:val="28"/>
+          <w:lang w:eastAsia="ru-RU"/>
+        </w:rPr>
+      </w:pPr>
+      <w:r>
+        <w:rPr>
+          <w:rFonts w:ascii="Times New Roman" w:eastAsia="Times New Roman" w:hAnsi="Times New Roman" w:cs="Times New Roman"/>
+          <w:b/>
+          <w:bCs/>
+          <w:sz w:val="28"/>
+          <w:szCs w:val="28"/>
+          <w:lang w:eastAsia="ru-RU"/>
+        </w:rPr>
+        <w:t>Модуль документов</w:t>
+      </w:r>
+      <w:r>
+        <w:rPr>
+          <w:rFonts w:ascii="Times New Roman" w:eastAsia="Times New Roman" w:hAnsi="Times New Roman" w:cs="Times New Roman"/>
+          <w:sz w:val="28"/>
+          <w:szCs w:val="28"/>
+          <w:lang w:eastAsia="ru-RU"/>
+        </w:rPr>
+        <w:t xml:space="preserve"> </w:t>
+      </w:r>
+      <w:r>
+        <w:rPr>
+          <w:rFonts w:ascii="Times New Roman" w:eastAsia="Times New Roman" w:hAnsi="Times New Roman" w:cs="Times New Roman"/>
+          <w:sz w:val="28"/>
+          <w:szCs w:val="28"/>
+          <w:lang w:eastAsia="ru-RU"/>
+        </w:rPr>
+        <w:t>-</w:t>
+      </w:r>
+      <w:r>
+        <w:rPr>
+          <w:rFonts w:ascii="Times New Roman" w:eastAsia="Times New Roman" w:hAnsi="Times New Roman" w:cs="Times New Roman"/>
+          <w:sz w:val="28"/>
+          <w:szCs w:val="28"/>
+          <w:lang w:eastAsia="ru-RU"/>
+        </w:rPr>
+        <w:t xml:space="preserve"> создает PDF-договоры по заявкам из шаблонов, а также позволяет загружать и выгружать данные в формате Excel.</w:t>
+      </w:r>
+    </w:p>
+    <w:p>
+      <w:pPr>
+        <w:numPr>
+          <w:ilvl w:val="0"/>
+          <w:numId w:val="18"/>
+        </w:numPr>
+        <w:spacing w:after="0" w:line="360" w:lineRule="auto"/>
+        <w:ind w:left="0" w:firstLine="851"/>
+        <w:contextualSpacing/>
+        <w:jc w:val="both"/>
+        <w:rPr>
+          <w:rFonts w:ascii="Times New Roman" w:eastAsia="Times New Roman" w:hAnsi="Times New Roman" w:cs="Times New Roman"/>
+          <w:sz w:val="28"/>
+          <w:szCs w:val="28"/>
+          <w:lang w:eastAsia="ru-RU"/>
+        </w:rPr>
+      </w:pPr>
+      <w:r>
+        <w:rPr>
+          <w:rFonts w:ascii="Times New Roman" w:eastAsia="Times New Roman" w:hAnsi="Times New Roman" w:cs="Times New Roman"/>
+          <w:b/>
+          <w:bCs/>
+          <w:sz w:val="28"/>
+          <w:szCs w:val="28"/>
+          <w:lang w:eastAsia="ru-RU"/>
+        </w:rPr>
+        <w:t>Модуль аналитики</w:t>
+      </w:r>
+      <w:r>
+        <w:rPr>
+          <w:rFonts w:ascii="Times New Roman" w:eastAsia="Times New Roman" w:hAnsi="Times New Roman" w:cs="Times New Roman"/>
+          <w:sz w:val="28"/>
+          <w:szCs w:val="28"/>
+          <w:lang w:eastAsia="ru-RU"/>
+        </w:rPr>
+        <w:t xml:space="preserve"> </w:t>
+      </w:r>
+      <w:r>
+        <w:rPr>
+          <w:rFonts w:ascii="Times New Roman" w:eastAsia="Times New Roman" w:hAnsi="Times New Roman" w:cs="Times New Roman"/>
+          <w:sz w:val="28"/>
+          <w:szCs w:val="28"/>
+          <w:lang w:eastAsia="ru-RU"/>
+        </w:rPr>
+        <w:t>-</w:t>
+      </w:r>
+      <w:r>
+        <w:rPr>
+          <w:rFonts w:ascii="Times New Roman" w:eastAsia="Times New Roman" w:hAnsi="Times New Roman" w:cs="Times New Roman"/>
+          <w:sz w:val="28"/>
+          <w:szCs w:val="28"/>
+          <w:lang w:eastAsia="ru-RU"/>
+        </w:rPr>
+        <w:t xml:space="preserve"> собирает статистику по заявкам и сотрудникам, строит графики для руководителя.</w:t>
+      </w:r>
+    </w:p>
+    <w:p>
+      <w:pPr>
+        <w:numPr>
+          <w:ilvl w:val="0"/>
+          <w:numId w:val="18"/>
+        </w:numPr>
+        <w:spacing w:after="0" w:line="360" w:lineRule="auto"/>
+        <w:ind w:left="0" w:firstLine="851"/>
+        <w:contextualSpacing/>
+        <w:jc w:val="both"/>
+        <w:rPr>
+          <w:rFonts w:ascii="Times New Roman" w:eastAsia="Times New Roman" w:hAnsi="Times New Roman" w:cs="Times New Roman"/>
+          <w:sz w:val="28"/>
+          <w:szCs w:val="28"/>
+          <w:lang w:eastAsia="ru-RU"/>
+        </w:rPr>
+      </w:pPr>
+      <w:r>
+        <w:rPr>
+          <w:rFonts w:ascii="Times New Roman" w:eastAsia="Times New Roman" w:hAnsi="Times New Roman" w:cs="Times New Roman"/>
+          <w:b/>
+          <w:bCs/>
+          <w:sz w:val="28"/>
+          <w:szCs w:val="28"/>
+          <w:lang w:eastAsia="ru-RU"/>
+        </w:rPr>
+        <w:t>База данных</w:t>
+      </w:r>
+      <w:r>
+        <w:rPr>
+          <w:rFonts w:ascii="Times New Roman" w:eastAsia="Times New Roman" w:hAnsi="Times New Roman" w:cs="Times New Roman"/>
+          <w:sz w:val="28"/>
+          <w:szCs w:val="28"/>
+          <w:lang w:eastAsia="ru-RU"/>
+        </w:rPr>
+        <w:t xml:space="preserve"> </w:t>
+      </w:r>
+      <w:r>
+        <w:rPr>
+          <w:rFonts w:ascii="Times New Roman" w:eastAsia="Times New Roman" w:hAnsi="Times New Roman" w:cs="Times New Roman"/>
+          <w:sz w:val="28"/>
+          <w:szCs w:val="28"/>
+          <w:lang w:eastAsia="ru-RU"/>
+        </w:rPr>
+        <w:t>-</w:t>
+      </w:r>
+      <w:r>
+        <w:rPr>
+          <w:rFonts w:ascii="Times New Roman" w:eastAsia="Times New Roman" w:hAnsi="Times New Roman" w:cs="Times New Roman"/>
+          <w:sz w:val="28"/>
+          <w:szCs w:val="28"/>
+          <w:lang w:eastAsia="ru-RU"/>
+        </w:rPr>
+        <w:t xml:space="preserve"> хранит всю информацию системы: пользователей, заявки, комментарии и сообщения чата.</w:t>
+      </w:r>
+    </w:p>
+    <w:p>
+      <w:pPr>
+        <w:numPr>
+          <w:ilvl w:val="0"/>
+          <w:numId w:val="18"/>
+        </w:numPr>
+        <w:spacing w:after="0" w:line="360" w:lineRule="auto"/>
+        <w:ind w:left="0" w:firstLine="851"/>
+        <w:contextualSpacing/>
+        <w:jc w:val="both"/>
+        <w:rPr>
+          <w:rFonts w:ascii="Times New Roman" w:eastAsia="Times New Roman" w:hAnsi="Times New Roman" w:cs="Times New Roman"/>
+          <w:sz w:val="28"/>
+          <w:szCs w:val="28"/>
+          <w:lang w:eastAsia="ru-RU"/>
+        </w:rPr>
+      </w:pPr>
+      <w:r>
+        <w:rPr>
+          <w:rFonts w:ascii="Times New Roman" w:eastAsia="Times New Roman" w:hAnsi="Times New Roman" w:cs="Times New Roman"/>
+          <w:b/>
+          <w:bCs/>
+          <w:sz w:val="28"/>
+          <w:szCs w:val="28"/>
+          <w:lang w:eastAsia="ru-RU"/>
+        </w:rPr>
+        <w:t>Файловое хранилище</w:t>
+      </w:r>
+      <w:r>
+        <w:rPr>
+          <w:rFonts w:ascii="Times New Roman" w:eastAsia="Times New Roman" w:hAnsi="Times New Roman" w:cs="Times New Roman"/>
+          <w:sz w:val="28"/>
+          <w:szCs w:val="28"/>
+          <w:lang w:eastAsia="ru-RU"/>
+        </w:rPr>
+        <w:t xml:space="preserve"> </w:t>
+      </w:r>
+      <w:r>
+        <w:rPr>
+          <w:rFonts w:ascii="Times New Roman" w:eastAsia="Times New Roman" w:hAnsi="Times New Roman" w:cs="Times New Roman"/>
+          <w:sz w:val="28"/>
+          <w:szCs w:val="28"/>
+          <w:lang w:eastAsia="ru-RU"/>
+        </w:rPr>
+        <w:t>-</w:t>
+      </w:r>
+      <w:r>
+        <w:rPr>
+          <w:rFonts w:ascii="Times New Roman" w:eastAsia="Times New Roman" w:hAnsi="Times New Roman" w:cs="Times New Roman"/>
+          <w:sz w:val="28"/>
+          <w:szCs w:val="28"/>
+          <w:lang w:eastAsia="ru-RU"/>
+        </w:rPr>
+        <w:t xml:space="preserve"> папка на сервере, где лежат сгенерированные PDF-договоры, шаблоны документов и вложения к заявкам.</w:t>
+      </w:r>
     </w:p>
     <w:p>
       <w:pPr>
@@ -7230,6 +6928,766 @@
           <w:lang w:eastAsia="ru-RU"/>
         </w:rPr>
       </w:pPr>
+      <w:r>
+        <w:rPr>
+          <w:rFonts w:ascii="Times New Roman" w:eastAsia="Times New Roman" w:hAnsi="Times New Roman" w:cs="Times New Roman"/>
+          <w:b/>
+          <w:bCs/>
+          <w:sz w:val="28"/>
+          <w:szCs w:val="28"/>
+          <w:lang w:eastAsia="ru-RU"/>
+        </w:rPr>
+        <w:t>Взаимодействие компонентов:</w:t>
+      </w:r>
+      <w:r>
+        <w:rPr>
+          <w:rFonts w:ascii="Times New Roman" w:eastAsia="Times New Roman" w:hAnsi="Times New Roman" w:cs="Times New Roman"/>
+          <w:sz w:val="28"/>
+          <w:szCs w:val="28"/>
+          <w:lang w:eastAsia="ru-RU"/>
+        </w:rPr>
+        <w:t xml:space="preserve"> Пользователь работает через веб-интерфейс: входит в систему, создает заявки, пишет в чат. Веб-интерфейс отправляет запросы к соответствующим модулям серверной части. Все модули серверной части читают и записывают данные в единую базу данных. Когда нужно создать договор или отчет, модули обращаются к файловому хранилищу.</w:t>
+      </w:r>
+    </w:p>
+    <w:p>
+      <w:pPr>
+        <w:spacing w:after="0" w:line="360" w:lineRule="auto"/>
+        <w:contextualSpacing/>
+        <w:jc w:val="center"/>
+        <w:rPr>
+          <w:rFonts w:ascii="Times New Roman" w:eastAsia="Times New Roman" w:hAnsi="Times New Roman" w:cs="Times New Roman"/>
+          <w:sz w:val="28"/>
+          <w:szCs w:val="28"/>
+          <w:lang w:eastAsia="ru-RU"/>
+        </w:rPr>
+      </w:pPr>
+      <w:r>
+        <w:rPr>
+          <w:rFonts w:ascii="Times New Roman" w:eastAsia="Times New Roman" w:hAnsi="Times New Roman" w:cs="Times New Roman"/>
+          <w:sz w:val="28"/>
+          <w:szCs w:val="28"/>
+          <w:lang w:eastAsia="ru-RU"/>
+        </w:rPr>
+        <w:drawing>
+          <wp:inline distT="0" distB="0" distL="0" distR="0" wp14:anchorId="6E5CE14B" wp14:editId="31BD1CC7">
+            <wp:extent cx="3221779" cy="3401226"/>
+            <wp:effectExtent l="0" t="0" r="0" b="8890"/>
+            <wp:docPr id="965259880" name="Рисунок 1"/>
+            <wp:cNvGraphicFramePr>
+              <a:graphicFrameLocks xmlns:a="http://schemas.openxmlformats.org/drawingml/2006/main" noChangeAspect="1"/>
+            </wp:cNvGraphicFramePr>
+            <a:graphic xmlns:a="http://schemas.openxmlformats.org/drawingml/2006/main">
+              <a:graphicData uri="http://schemas.openxmlformats.org/drawingml/2006/picture">
+                <pic:pic xmlns:pic="http://schemas.openxmlformats.org/drawingml/2006/picture">
+                  <pic:nvPicPr>
+                    <pic:cNvPr id="965259880" name=""/>
+                    <pic:cNvPicPr/>
+                  </pic:nvPicPr>
+                  <pic:blipFill>
+                    <a:blip r:embed="rId9"/>
+                    <a:stretch>
+                      <a:fillRect/>
+                    </a:stretch>
+                  </pic:blipFill>
+                  <pic:spPr>
+                    <a:xfrm>
+                      <a:off x="0" y="0"/>
+                      <a:ext cx="3227171" cy="3406918"/>
+                    </a:xfrm>
+                    <a:prstGeom prst="rect">
+                      <a:avLst/>
+                    </a:prstGeom>
+                  </pic:spPr>
+                </pic:pic>
+              </a:graphicData>
+            </a:graphic>
+          </wp:inline>
+        </w:drawing>
+      </w:r>
+    </w:p>
+    <w:p>
+      <w:pPr>
+        <w:spacing w:after="0" w:line="360" w:lineRule="auto"/>
+        <w:contextualSpacing/>
+        <w:jc w:val="center"/>
+        <w:rPr>
+          <w:rFonts w:ascii="Times New Roman" w:eastAsia="Times New Roman" w:hAnsi="Times New Roman" w:cs="Times New Roman"/>
+          <w:sz w:val="28"/>
+          <w:szCs w:val="28"/>
+          <w:lang w:eastAsia="ru-RU"/>
+        </w:rPr>
+      </w:pPr>
+      <w:r>
+        <w:rPr>
+          <w:rFonts w:ascii="Times New Roman" w:eastAsia="Times New Roman" w:hAnsi="Times New Roman" w:cs="Times New Roman"/>
+          <w:sz w:val="28"/>
+          <w:szCs w:val="28"/>
+          <w:lang w:eastAsia="ru-RU"/>
+        </w:rPr>
+        <w:t>Рисунок 2. Диаграмма компонентов</w:t>
+      </w:r>
+    </w:p>
+    <w:p>
+      <w:pPr>
+        <w:pStyle w:val="2"/>
+        <w:rPr>
+          <w:rFonts w:eastAsia="Times New Roman" w:cs="Times New Roman"/>
+          <w:szCs w:val="28"/>
+          <w:lang w:eastAsia="ru-RU"/>
+        </w:rPr>
+      </w:pPr>
+      <w:r>
+        <w:rPr>
+          <w:rFonts w:eastAsia="Times New Roman" w:cs="Times New Roman"/>
+          <w:szCs w:val="28"/>
+          <w:lang w:eastAsia="ru-RU"/>
+        </w:rPr>
+        <w:lastRenderedPageBreak/>
+        <w:t>3.3 Диаграмма развертывания</w:t>
+      </w:r>
+    </w:p>
+    <w:p>
+      <w:pPr>
+        <w:spacing w:after="0" w:line="360" w:lineRule="auto"/>
+        <w:ind w:firstLine="851"/>
+        <w:contextualSpacing/>
+        <w:jc w:val="both"/>
+        <w:rPr>
+          <w:rFonts w:ascii="Times New Roman" w:eastAsia="Times New Roman" w:hAnsi="Times New Roman" w:cs="Times New Roman"/>
+          <w:sz w:val="28"/>
+          <w:szCs w:val="28"/>
+          <w:lang w:eastAsia="ru-RU"/>
+        </w:rPr>
+      </w:pPr>
+      <w:r>
+        <w:rPr>
+          <w:rFonts w:ascii="Times New Roman" w:eastAsia="Times New Roman" w:hAnsi="Times New Roman" w:cs="Times New Roman"/>
+          <w:sz w:val="28"/>
+          <w:szCs w:val="28"/>
+          <w:lang w:eastAsia="ru-RU"/>
+        </w:rPr>
+        <w:t>Диаграмма развертывания показывает, на каких физических устройствах и в каких программах работает система в реальных условиях.</w:t>
+      </w:r>
+    </w:p>
+    <w:p>
+      <w:pPr>
+        <w:spacing w:after="0" w:line="360" w:lineRule="auto"/>
+        <w:ind w:firstLine="851"/>
+        <w:contextualSpacing/>
+        <w:jc w:val="both"/>
+        <w:rPr>
+          <w:rFonts w:ascii="Times New Roman" w:eastAsia="Times New Roman" w:hAnsi="Times New Roman" w:cs="Times New Roman"/>
+          <w:sz w:val="28"/>
+          <w:szCs w:val="28"/>
+          <w:lang w:eastAsia="ru-RU"/>
+        </w:rPr>
+      </w:pPr>
+      <w:r>
+        <w:rPr>
+          <w:rFonts w:ascii="Times New Roman" w:eastAsia="Times New Roman" w:hAnsi="Times New Roman" w:cs="Times New Roman"/>
+          <w:b/>
+          <w:bCs/>
+          <w:sz w:val="28"/>
+          <w:szCs w:val="28"/>
+          <w:lang w:eastAsia="ru-RU"/>
+        </w:rPr>
+        <w:t>Основные узлы развертывания:</w:t>
+      </w:r>
+    </w:p>
+    <w:p>
+      <w:pPr>
+        <w:numPr>
+          <w:ilvl w:val="0"/>
+          <w:numId w:val="19"/>
+        </w:numPr>
+        <w:spacing w:after="0" w:line="360" w:lineRule="auto"/>
+        <w:ind w:left="0" w:firstLine="851"/>
+        <w:contextualSpacing/>
+        <w:jc w:val="both"/>
+        <w:rPr>
+          <w:rFonts w:ascii="Times New Roman" w:eastAsia="Times New Roman" w:hAnsi="Times New Roman" w:cs="Times New Roman"/>
+          <w:sz w:val="28"/>
+          <w:szCs w:val="28"/>
+          <w:lang w:eastAsia="ru-RU"/>
+        </w:rPr>
+      </w:pPr>
+      <w:r>
+        <w:rPr>
+          <w:rFonts w:ascii="Times New Roman" w:eastAsia="Times New Roman" w:hAnsi="Times New Roman" w:cs="Times New Roman"/>
+          <w:b/>
+          <w:bCs/>
+          <w:sz w:val="28"/>
+          <w:szCs w:val="28"/>
+          <w:lang w:eastAsia="ru-RU"/>
+        </w:rPr>
+        <w:t>Устройство пользователя</w:t>
+      </w:r>
+      <w:r>
+        <w:rPr>
+          <w:rFonts w:ascii="Times New Roman" w:eastAsia="Times New Roman" w:hAnsi="Times New Roman" w:cs="Times New Roman"/>
+          <w:sz w:val="28"/>
+          <w:szCs w:val="28"/>
+          <w:lang w:eastAsia="ru-RU"/>
+        </w:rPr>
+        <w:t xml:space="preserve"> </w:t>
+      </w:r>
+      <w:r>
+        <w:rPr>
+          <w:rFonts w:ascii="Times New Roman" w:eastAsia="Times New Roman" w:hAnsi="Times New Roman" w:cs="Times New Roman"/>
+          <w:sz w:val="28"/>
+          <w:szCs w:val="28"/>
+          <w:lang w:eastAsia="ru-RU"/>
+        </w:rPr>
+        <w:t>-</w:t>
+      </w:r>
+      <w:r>
+        <w:rPr>
+          <w:rFonts w:ascii="Times New Roman" w:eastAsia="Times New Roman" w:hAnsi="Times New Roman" w:cs="Times New Roman"/>
+          <w:sz w:val="28"/>
+          <w:szCs w:val="28"/>
+          <w:lang w:eastAsia="ru-RU"/>
+        </w:rPr>
+        <w:t xml:space="preserve"> на нем запущен веб-браузер, через который клиент или сотрудник работает с системой.</w:t>
+      </w:r>
+    </w:p>
+    <w:p>
+      <w:pPr>
+        <w:numPr>
+          <w:ilvl w:val="0"/>
+          <w:numId w:val="19"/>
+        </w:numPr>
+        <w:spacing w:after="0" w:line="360" w:lineRule="auto"/>
+        <w:ind w:left="0" w:firstLine="851"/>
+        <w:contextualSpacing/>
+        <w:jc w:val="both"/>
+        <w:rPr>
+          <w:rFonts w:ascii="Times New Roman" w:eastAsia="Times New Roman" w:hAnsi="Times New Roman" w:cs="Times New Roman"/>
+          <w:sz w:val="28"/>
+          <w:szCs w:val="28"/>
+          <w:lang w:eastAsia="ru-RU"/>
+        </w:rPr>
+      </w:pPr>
+      <w:r>
+        <w:rPr>
+          <w:rFonts w:ascii="Times New Roman" w:eastAsia="Times New Roman" w:hAnsi="Times New Roman" w:cs="Times New Roman"/>
+          <w:b/>
+          <w:bCs/>
+          <w:sz w:val="28"/>
+          <w:szCs w:val="28"/>
+          <w:lang w:eastAsia="ru-RU"/>
+        </w:rPr>
+        <w:t>Сервер</w:t>
+      </w:r>
+      <w:r>
+        <w:rPr>
+          <w:rFonts w:ascii="Times New Roman" w:eastAsia="Times New Roman" w:hAnsi="Times New Roman" w:cs="Times New Roman"/>
+          <w:sz w:val="28"/>
+          <w:szCs w:val="28"/>
+          <w:lang w:eastAsia="ru-RU"/>
+        </w:rPr>
+        <w:t xml:space="preserve"> </w:t>
+      </w:r>
+      <w:r>
+        <w:rPr>
+          <w:rFonts w:ascii="Times New Roman" w:eastAsia="Times New Roman" w:hAnsi="Times New Roman" w:cs="Times New Roman"/>
+          <w:sz w:val="28"/>
+          <w:szCs w:val="28"/>
+          <w:lang w:eastAsia="ru-RU"/>
+        </w:rPr>
+        <w:t>-</w:t>
+      </w:r>
+      <w:r>
+        <w:rPr>
+          <w:rFonts w:ascii="Times New Roman" w:eastAsia="Times New Roman" w:hAnsi="Times New Roman" w:cs="Times New Roman"/>
+          <w:sz w:val="28"/>
+          <w:szCs w:val="28"/>
+          <w:lang w:eastAsia="ru-RU"/>
+        </w:rPr>
+        <w:t xml:space="preserve"> компьютер, на котором круглосуточно работает программа. Внутри сервера используются технологии Docker (контейнеры), чтобы все части системы работали изолированно. На сервере размещены:</w:t>
+      </w:r>
+    </w:p>
+    <w:p>
+      <w:pPr>
+        <w:numPr>
+          <w:ilvl w:val="1"/>
+          <w:numId w:val="20"/>
+        </w:numPr>
+        <w:spacing w:after="0" w:line="360" w:lineRule="auto"/>
+        <w:ind w:left="567" w:firstLine="709"/>
+        <w:contextualSpacing/>
+        <w:jc w:val="both"/>
+        <w:rPr>
+          <w:rFonts w:ascii="Times New Roman" w:eastAsia="Times New Roman" w:hAnsi="Times New Roman" w:cs="Times New Roman"/>
+          <w:sz w:val="28"/>
+          <w:szCs w:val="28"/>
+          <w:lang w:eastAsia="ru-RU"/>
+        </w:rPr>
+      </w:pPr>
+      <w:r>
+        <w:rPr>
+          <w:rFonts w:ascii="Times New Roman" w:eastAsia="Times New Roman" w:hAnsi="Times New Roman" w:cs="Times New Roman"/>
+          <w:b/>
+          <w:bCs/>
+          <w:sz w:val="28"/>
+          <w:szCs w:val="28"/>
+          <w:lang w:eastAsia="ru-RU"/>
+        </w:rPr>
+        <w:t>Веб-сервер</w:t>
+      </w:r>
+      <w:r>
+        <w:rPr>
+          <w:rFonts w:ascii="Times New Roman" w:eastAsia="Times New Roman" w:hAnsi="Times New Roman" w:cs="Times New Roman"/>
+          <w:b/>
+          <w:bCs/>
+          <w:sz w:val="28"/>
+          <w:szCs w:val="28"/>
+          <w:lang w:eastAsia="ru-RU"/>
+        </w:rPr>
+        <w:t xml:space="preserve"> (Точка </w:t>
+      </w:r>
+      <w:r>
+        <w:rPr>
+          <w:rFonts w:ascii="Times New Roman" w:eastAsia="Times New Roman" w:hAnsi="Times New Roman" w:cs="Times New Roman"/>
+          <w:b/>
+          <w:bCs/>
+          <w:sz w:val="28"/>
+          <w:szCs w:val="28"/>
+          <w:lang w:eastAsia="ru-RU"/>
+        </w:rPr>
+        <w:t>входа)</w:t>
+      </w:r>
+      <w:r>
+        <w:rPr>
+          <w:rFonts w:ascii="Times New Roman" w:eastAsia="Times New Roman" w:hAnsi="Times New Roman" w:cs="Times New Roman"/>
+          <w:sz w:val="28"/>
+          <w:szCs w:val="28"/>
+          <w:lang w:eastAsia="ru-RU"/>
+        </w:rPr>
+        <w:t xml:space="preserve"> </w:t>
+      </w:r>
+      <w:r>
+        <w:rPr>
+          <w:rFonts w:ascii="Times New Roman" w:eastAsia="Times New Roman" w:hAnsi="Times New Roman" w:cs="Times New Roman"/>
+          <w:sz w:val="28"/>
+          <w:szCs w:val="28"/>
+          <w:lang w:eastAsia="ru-RU"/>
+        </w:rPr>
+        <w:t>-</w:t>
+      </w:r>
+      <w:r>
+        <w:rPr>
+          <w:rFonts w:ascii="Times New Roman" w:eastAsia="Times New Roman" w:hAnsi="Times New Roman" w:cs="Times New Roman"/>
+          <w:sz w:val="28"/>
+          <w:szCs w:val="28"/>
+          <w:lang w:eastAsia="ru-RU"/>
+        </w:rPr>
+        <w:t xml:space="preserve"> </w:t>
+      </w:r>
+      <w:r>
+        <w:rPr>
+          <w:rFonts w:ascii="Times New Roman" w:eastAsia="Times New Roman" w:hAnsi="Times New Roman" w:cs="Times New Roman"/>
+          <w:sz w:val="28"/>
+          <w:szCs w:val="28"/>
+          <w:lang w:eastAsia="ru-RU"/>
+        </w:rPr>
+        <w:t>принимает все запросы из интернета, обслуживает статические файлы сайта (картинки, стили) и передает сложные запросы к основной программе.</w:t>
+      </w:r>
+    </w:p>
+    <w:p>
+      <w:pPr>
+        <w:numPr>
+          <w:ilvl w:val="1"/>
+          <w:numId w:val="20"/>
+        </w:numPr>
+        <w:spacing w:after="0" w:line="360" w:lineRule="auto"/>
+        <w:ind w:left="567" w:firstLine="709"/>
+        <w:contextualSpacing/>
+        <w:jc w:val="both"/>
+        <w:rPr>
+          <w:rFonts w:ascii="Times New Roman" w:eastAsia="Times New Roman" w:hAnsi="Times New Roman" w:cs="Times New Roman"/>
+          <w:sz w:val="28"/>
+          <w:szCs w:val="28"/>
+          <w:lang w:eastAsia="ru-RU"/>
+        </w:rPr>
+      </w:pPr>
+      <w:r>
+        <w:rPr>
+          <w:rFonts w:ascii="Times New Roman" w:eastAsia="Times New Roman" w:hAnsi="Times New Roman" w:cs="Times New Roman"/>
+          <w:b/>
+          <w:bCs/>
+          <w:sz w:val="28"/>
+          <w:szCs w:val="28"/>
+          <w:lang w:eastAsia="ru-RU"/>
+        </w:rPr>
+        <w:t>Контейнер с программой</w:t>
+      </w:r>
+      <w:r>
+        <w:rPr>
+          <w:rFonts w:ascii="Times New Roman" w:eastAsia="Times New Roman" w:hAnsi="Times New Roman" w:cs="Times New Roman"/>
+          <w:sz w:val="28"/>
+          <w:szCs w:val="28"/>
+          <w:lang w:eastAsia="ru-RU"/>
+        </w:rPr>
+        <w:t xml:space="preserve"> </w:t>
+      </w:r>
+      <w:r>
+        <w:rPr>
+          <w:rFonts w:ascii="Times New Roman" w:eastAsia="Times New Roman" w:hAnsi="Times New Roman" w:cs="Times New Roman"/>
+          <w:sz w:val="28"/>
+          <w:szCs w:val="28"/>
+          <w:lang w:eastAsia="ru-RU"/>
+        </w:rPr>
+        <w:t>-</w:t>
+      </w:r>
+      <w:r>
+        <w:rPr>
+          <w:rFonts w:ascii="Times New Roman" w:eastAsia="Times New Roman" w:hAnsi="Times New Roman" w:cs="Times New Roman"/>
+          <w:sz w:val="28"/>
+          <w:szCs w:val="28"/>
+          <w:lang w:eastAsia="ru-RU"/>
+        </w:rPr>
+        <w:t xml:space="preserve"> </w:t>
+      </w:r>
+      <w:r>
+        <w:rPr>
+          <w:rFonts w:ascii="Times New Roman" w:eastAsia="Times New Roman" w:hAnsi="Times New Roman" w:cs="Times New Roman"/>
+          <w:sz w:val="28"/>
+          <w:szCs w:val="28"/>
+          <w:lang w:eastAsia="ru-RU"/>
+        </w:rPr>
+        <w:t>здесь работает серверная часть системы «ITRexHelper» со всеми модулями обработки заявок и чата.</w:t>
+      </w:r>
+    </w:p>
+    <w:p>
+      <w:pPr>
+        <w:numPr>
+          <w:ilvl w:val="1"/>
+          <w:numId w:val="20"/>
+        </w:numPr>
+        <w:spacing w:after="0" w:line="360" w:lineRule="auto"/>
+        <w:ind w:left="567" w:firstLine="709"/>
+        <w:contextualSpacing/>
+        <w:jc w:val="both"/>
+        <w:rPr>
+          <w:rFonts w:ascii="Times New Roman" w:eastAsia="Times New Roman" w:hAnsi="Times New Roman" w:cs="Times New Roman"/>
+          <w:sz w:val="28"/>
+          <w:szCs w:val="28"/>
+          <w:lang w:eastAsia="ru-RU"/>
+        </w:rPr>
+      </w:pPr>
+      <w:r>
+        <w:rPr>
+          <w:rFonts w:ascii="Times New Roman" w:eastAsia="Times New Roman" w:hAnsi="Times New Roman" w:cs="Times New Roman"/>
+          <w:b/>
+          <w:bCs/>
+          <w:sz w:val="28"/>
+          <w:szCs w:val="28"/>
+          <w:lang w:eastAsia="ru-RU"/>
+        </w:rPr>
+        <w:t>Контейнер с базой данных</w:t>
+      </w:r>
+      <w:r>
+        <w:rPr>
+          <w:rFonts w:ascii="Times New Roman" w:eastAsia="Times New Roman" w:hAnsi="Times New Roman" w:cs="Times New Roman"/>
+          <w:sz w:val="28"/>
+          <w:szCs w:val="28"/>
+          <w:lang w:eastAsia="ru-RU"/>
+        </w:rPr>
+        <w:t xml:space="preserve"> </w:t>
+      </w:r>
+      <w:r>
+        <w:rPr>
+          <w:rFonts w:ascii="Times New Roman" w:eastAsia="Times New Roman" w:hAnsi="Times New Roman" w:cs="Times New Roman"/>
+          <w:sz w:val="28"/>
+          <w:szCs w:val="28"/>
+          <w:lang w:eastAsia="ru-RU"/>
+        </w:rPr>
+        <w:t>-</w:t>
+      </w:r>
+      <w:r>
+        <w:rPr>
+          <w:rFonts w:ascii="Times New Roman" w:eastAsia="Times New Roman" w:hAnsi="Times New Roman" w:cs="Times New Roman"/>
+          <w:sz w:val="28"/>
+          <w:szCs w:val="28"/>
+          <w:lang w:eastAsia="ru-RU"/>
+        </w:rPr>
+        <w:t xml:space="preserve"> изолированный контейнер, в котором надежно хранятся все данные.</w:t>
+      </w:r>
+    </w:p>
+    <w:p>
+      <w:pPr>
+        <w:numPr>
+          <w:ilvl w:val="1"/>
+          <w:numId w:val="20"/>
+        </w:numPr>
+        <w:spacing w:after="0" w:line="360" w:lineRule="auto"/>
+        <w:ind w:left="567" w:firstLine="709"/>
+        <w:contextualSpacing/>
+        <w:jc w:val="both"/>
+        <w:rPr>
+          <w:rFonts w:ascii="Times New Roman" w:eastAsia="Times New Roman" w:hAnsi="Times New Roman" w:cs="Times New Roman"/>
+          <w:sz w:val="28"/>
+          <w:szCs w:val="28"/>
+          <w:lang w:eastAsia="ru-RU"/>
+        </w:rPr>
+      </w:pPr>
+      <w:r>
+        <w:rPr>
+          <w:rFonts w:ascii="Times New Roman" w:eastAsia="Times New Roman" w:hAnsi="Times New Roman" w:cs="Times New Roman"/>
+          <w:b/>
+          <w:bCs/>
+          <w:sz w:val="28"/>
+          <w:szCs w:val="28"/>
+          <w:lang w:eastAsia="ru-RU"/>
+        </w:rPr>
+        <w:t>Файловое хранилище</w:t>
+      </w:r>
+      <w:r>
+        <w:rPr>
+          <w:rFonts w:ascii="Times New Roman" w:eastAsia="Times New Roman" w:hAnsi="Times New Roman" w:cs="Times New Roman"/>
+          <w:sz w:val="28"/>
+          <w:szCs w:val="28"/>
+          <w:lang w:eastAsia="ru-RU"/>
+        </w:rPr>
+        <w:t xml:space="preserve"> </w:t>
+      </w:r>
+      <w:r>
+        <w:rPr>
+          <w:rFonts w:ascii="Times New Roman" w:eastAsia="Times New Roman" w:hAnsi="Times New Roman" w:cs="Times New Roman"/>
+          <w:sz w:val="28"/>
+          <w:szCs w:val="28"/>
+          <w:lang w:eastAsia="ru-RU"/>
+        </w:rPr>
+        <w:t>-</w:t>
+      </w:r>
+      <w:r>
+        <w:rPr>
+          <w:rFonts w:ascii="Times New Roman" w:eastAsia="Times New Roman" w:hAnsi="Times New Roman" w:cs="Times New Roman"/>
+          <w:sz w:val="28"/>
+          <w:szCs w:val="28"/>
+          <w:lang w:eastAsia="ru-RU"/>
+        </w:rPr>
+        <w:t xml:space="preserve"> отдельное место на диске сервера, где хранятся PDF-договоры и шаблоны документов.</w:t>
+      </w:r>
+    </w:p>
+    <w:p>
+      <w:pPr>
+        <w:numPr>
+          <w:ilvl w:val="0"/>
+          <w:numId w:val="19"/>
+        </w:numPr>
+        <w:spacing w:after="0" w:line="360" w:lineRule="auto"/>
+        <w:ind w:left="0" w:firstLine="851"/>
+        <w:contextualSpacing/>
+        <w:jc w:val="both"/>
+        <w:rPr>
+          <w:rFonts w:ascii="Times New Roman" w:eastAsia="Times New Roman" w:hAnsi="Times New Roman" w:cs="Times New Roman"/>
+          <w:sz w:val="28"/>
+          <w:szCs w:val="28"/>
+          <w:lang w:eastAsia="ru-RU"/>
+        </w:rPr>
+      </w:pPr>
+      <w:r>
+        <w:rPr>
+          <w:rFonts w:ascii="Times New Roman" w:eastAsia="Times New Roman" w:hAnsi="Times New Roman" w:cs="Times New Roman"/>
+          <w:b/>
+          <w:bCs/>
+          <w:sz w:val="28"/>
+          <w:szCs w:val="28"/>
+          <w:lang w:val="en-US" w:eastAsia="ru-RU"/>
+        </w:rPr>
+        <w:t>Ngrok</w:t>
+      </w:r>
+      <w:r>
+        <w:rPr>
+          <w:rFonts w:ascii="Times New Roman" w:eastAsia="Times New Roman" w:hAnsi="Times New Roman" w:cs="Times New Roman"/>
+          <w:b/>
+          <w:bCs/>
+          <w:sz w:val="28"/>
+          <w:szCs w:val="28"/>
+          <w:lang w:eastAsia="ru-RU"/>
+        </w:rPr>
+        <w:t>-</w:t>
+      </w:r>
+      <w:r>
+        <w:rPr>
+          <w:rFonts w:ascii="Times New Roman" w:eastAsia="Times New Roman" w:hAnsi="Times New Roman" w:cs="Times New Roman"/>
+          <w:b/>
+          <w:bCs/>
+          <w:sz w:val="28"/>
+          <w:szCs w:val="28"/>
+          <w:lang w:eastAsia="ru-RU"/>
+        </w:rPr>
+        <w:t>туннель</w:t>
+      </w:r>
+      <w:r>
+        <w:rPr>
+          <w:rFonts w:ascii="Times New Roman" w:eastAsia="Times New Roman" w:hAnsi="Times New Roman" w:cs="Times New Roman"/>
+          <w:sz w:val="28"/>
+          <w:szCs w:val="28"/>
+          <w:lang w:eastAsia="ru-RU"/>
+        </w:rPr>
+        <w:t xml:space="preserve"> </w:t>
+      </w:r>
+      <w:r>
+        <w:rPr>
+          <w:rFonts w:ascii="Times New Roman" w:eastAsia="Times New Roman" w:hAnsi="Times New Roman" w:cs="Times New Roman"/>
+          <w:sz w:val="28"/>
+          <w:szCs w:val="28"/>
+          <w:lang w:eastAsia="ru-RU"/>
+        </w:rPr>
+        <w:t>-</w:t>
+      </w:r>
+      <w:r>
+        <w:rPr>
+          <w:rFonts w:ascii="Times New Roman" w:eastAsia="Times New Roman" w:hAnsi="Times New Roman" w:cs="Times New Roman"/>
+          <w:sz w:val="28"/>
+          <w:szCs w:val="28"/>
+          <w:lang w:eastAsia="ru-RU"/>
+        </w:rPr>
+        <w:t xml:space="preserve"> используется на этапе разработки. С помощью программы Ngrok создается временный публичный адрес, чтобы можно было показать работу системы или протестировать её из интернета.</w:t>
+      </w:r>
+    </w:p>
+    <w:p>
+      <w:pPr>
+        <w:spacing w:after="0" w:line="360" w:lineRule="auto"/>
+        <w:ind w:firstLine="851"/>
+        <w:contextualSpacing/>
+        <w:jc w:val="both"/>
+        <w:rPr>
+          <w:rFonts w:ascii="Times New Roman" w:eastAsia="Times New Roman" w:hAnsi="Times New Roman" w:cs="Times New Roman"/>
+          <w:sz w:val="28"/>
+          <w:szCs w:val="28"/>
+          <w:lang w:eastAsia="ru-RU"/>
+        </w:rPr>
+      </w:pPr>
+      <w:r>
+        <w:rPr>
+          <w:rFonts w:ascii="Times New Roman" w:eastAsia="Times New Roman" w:hAnsi="Times New Roman" w:cs="Times New Roman"/>
+          <w:b/>
+          <w:bCs/>
+          <w:sz w:val="28"/>
+          <w:szCs w:val="28"/>
+          <w:lang w:eastAsia="ru-RU"/>
+        </w:rPr>
+        <w:t>Связи между устройствами:</w:t>
+      </w:r>
+      <w:r>
+        <w:rPr>
+          <w:rFonts w:ascii="Times New Roman" w:eastAsia="Times New Roman" w:hAnsi="Times New Roman" w:cs="Times New Roman"/>
+          <w:sz w:val="28"/>
+          <w:szCs w:val="28"/>
+          <w:lang w:eastAsia="ru-RU"/>
+        </w:rPr>
+        <w:t xml:space="preserve"> Пользователь через браузер отправляет защищенный запрос из интернета на сервер. Веб-сервер принимает этот запрос и передает его контейнеру с программой. Программа обращается к контейнеру с базой данных для чтения или записи информации и сохраняет файлы в файловое хранилище.</w:t>
+      </w:r>
+    </w:p>
+    <w:p>
+      <w:pPr>
+        <w:spacing w:after="0" w:line="360" w:lineRule="auto"/>
+        <w:contextualSpacing/>
+        <w:jc w:val="center"/>
+        <w:rPr>
+          <w:rFonts w:ascii="Times New Roman" w:eastAsia="Times New Roman" w:hAnsi="Times New Roman" w:cs="Times New Roman"/>
+          <w:sz w:val="28"/>
+          <w:szCs w:val="28"/>
+          <w:lang w:eastAsia="ru-RU"/>
+        </w:rPr>
+      </w:pPr>
+      <w:r>
+        <w:rPr>
+          <w:rFonts w:ascii="Times New Roman" w:eastAsia="Times New Roman" w:hAnsi="Times New Roman" w:cs="Times New Roman"/>
+          <w:sz w:val="28"/>
+          <w:szCs w:val="28"/>
+          <w:lang w:eastAsia="ru-RU"/>
+        </w:rPr>
+        <w:lastRenderedPageBreak/>
+        <w:drawing>
+          <wp:inline distT="0" distB="0" distL="0" distR="0" wp14:anchorId="37A168C9" wp14:editId="7890B369">
+            <wp:extent cx="5067723" cy="3947883"/>
+            <wp:effectExtent l="0" t="0" r="0" b="0"/>
+            <wp:docPr id="1573891284" name="Рисунок 1"/>
+            <wp:cNvGraphicFramePr>
+              <a:graphicFrameLocks xmlns:a="http://schemas.openxmlformats.org/drawingml/2006/main" noChangeAspect="1"/>
+            </wp:cNvGraphicFramePr>
+            <a:graphic xmlns:a="http://schemas.openxmlformats.org/drawingml/2006/main">
+              <a:graphicData uri="http://schemas.openxmlformats.org/drawingml/2006/picture">
+                <pic:pic xmlns:pic="http://schemas.openxmlformats.org/drawingml/2006/picture">
+                  <pic:nvPicPr>
+                    <pic:cNvPr id="1573891284" name=""/>
+                    <pic:cNvPicPr/>
+                  </pic:nvPicPr>
+                  <pic:blipFill>
+                    <a:blip r:embed="rId10"/>
+                    <a:stretch>
+                      <a:fillRect/>
+                    </a:stretch>
+                  </pic:blipFill>
+                  <pic:spPr>
+                    <a:xfrm>
+                      <a:off x="0" y="0"/>
+                      <a:ext cx="5072463" cy="3951576"/>
+                    </a:xfrm>
+                    <a:prstGeom prst="rect">
+                      <a:avLst/>
+                    </a:prstGeom>
+                  </pic:spPr>
+                </pic:pic>
+              </a:graphicData>
+            </a:graphic>
+          </wp:inline>
+        </w:drawing>
+      </w:r>
+    </w:p>
+    <w:p>
+      <w:pPr>
+        <w:spacing w:after="0" w:line="360" w:lineRule="auto"/>
+        <w:contextualSpacing/>
+        <w:jc w:val="center"/>
+        <w:rPr>
+          <w:rFonts w:ascii="Times New Roman" w:eastAsia="Times New Roman" w:hAnsi="Times New Roman" w:cs="Times New Roman"/>
+          <w:sz w:val="28"/>
+          <w:szCs w:val="28"/>
+          <w:lang w:eastAsia="ru-RU"/>
+        </w:rPr>
+      </w:pPr>
+      <w:r>
+        <w:rPr>
+          <w:rFonts w:ascii="Times New Roman" w:eastAsia="Times New Roman" w:hAnsi="Times New Roman" w:cs="Times New Roman"/>
+          <w:sz w:val="28"/>
+          <w:szCs w:val="28"/>
+          <w:lang w:eastAsia="ru-RU"/>
+        </w:rPr>
+        <w:t>Рисунок 3. – Диаграмма развертывания</w:t>
+      </w:r>
+    </w:p>
+    <w:p>
+      <w:pPr>
+        <w:spacing w:after="0" w:line="360" w:lineRule="auto"/>
+        <w:ind w:firstLine="851"/>
+        <w:contextualSpacing/>
+        <w:jc w:val="both"/>
+        <w:rPr>
+          <w:rFonts w:ascii="Times New Roman" w:eastAsia="Times New Roman" w:hAnsi="Times New Roman" w:cs="Times New Roman"/>
+          <w:sz w:val="28"/>
+          <w:szCs w:val="28"/>
+          <w:lang w:eastAsia="ru-RU"/>
+        </w:rPr>
+      </w:pPr>
+    </w:p>
+    <w:p>
+      <w:pPr>
+        <w:spacing w:after="0" w:line="360" w:lineRule="auto"/>
+        <w:ind w:firstLine="851"/>
+        <w:contextualSpacing/>
+        <w:jc w:val="both"/>
+        <w:rPr>
+          <w:rFonts w:ascii="Times New Roman" w:eastAsia="Times New Roman" w:hAnsi="Times New Roman" w:cs="Times New Roman"/>
+          <w:sz w:val="28"/>
+          <w:szCs w:val="28"/>
+          <w:lang w:eastAsia="ru-RU"/>
+        </w:rPr>
+      </w:pPr>
     </w:p>
     <w:p>
       <w:pPr>
@@ -7273,7 +7731,7 @@
           <w:lang w:eastAsia="ru-RU"/>
         </w:rPr>
       </w:pPr>
-      <w:bookmarkStart w:id="10" w:name="_Toc232191339"/>
+      <w:bookmarkStart w:id="9" w:name="_Toc232191339"/>
       <w:r>
         <w:rPr>
           <w:rFonts w:eastAsia="Times New Roman"/>
@@ -7283,7 +7741,7 @@
         <w:lastRenderedPageBreak/>
         <w:t>Часть проектирования</w:t>
       </w:r>
-      <w:bookmarkEnd w:id="10"/>
+      <w:bookmarkEnd w:id="9"/>
     </w:p>
     <w:p>
       <w:pPr>
@@ -7355,7 +7813,7 @@
           <w:lang w:eastAsia="ru-RU"/>
         </w:rPr>
       </w:pPr>
-      <w:bookmarkStart w:id="11" w:name="_Toc232191340"/>
+      <w:bookmarkStart w:id="10" w:name="_Toc232191340"/>
       <w:r>
         <w:rPr>
           <w:rFonts w:eastAsia="Times New Roman"/>
@@ -7365,7 +7823,7 @@
         <w:lastRenderedPageBreak/>
         <w:t>Часть разработки</w:t>
       </w:r>
-      <w:bookmarkEnd w:id="11"/>
+      <w:bookmarkEnd w:id="10"/>
     </w:p>
     <w:p>
       <w:pPr>
@@ -7465,7 +7923,7 @@
           <w:lang w:eastAsia="ru-RU"/>
         </w:rPr>
       </w:pPr>
-      <w:bookmarkStart w:id="12" w:name="_Toc232191341"/>
+      <w:bookmarkStart w:id="11" w:name="_Toc232191341"/>
       <w:r>
         <w:rPr>
           <w:rFonts w:eastAsia="Times New Roman"/>
@@ -7475,7 +7933,7 @@
         <w:lastRenderedPageBreak/>
         <w:t>Часть тестирования</w:t>
       </w:r>
-      <w:bookmarkEnd w:id="12"/>
+      <w:bookmarkEnd w:id="11"/>
     </w:p>
     <w:p>
       <w:pPr>
@@ -7561,7 +8019,7 @@
           <w:lang w:eastAsia="ru-RU"/>
         </w:rPr>
       </w:pPr>
-      <w:bookmarkStart w:id="13" w:name="_Toc232191342"/>
+      <w:bookmarkStart w:id="12" w:name="_Toc232191342"/>
       <w:r>
         <w:rPr>
           <w:rFonts w:eastAsia="Times New Roman"/>
@@ -7571,7 +8029,7 @@
         <w:lastRenderedPageBreak/>
         <w:t>Организация реализации проекта</w:t>
       </w:r>
-      <w:bookmarkEnd w:id="13"/>
+      <w:bookmarkEnd w:id="12"/>
     </w:p>
     <w:p>
       <w:pPr>
@@ -7657,7 +8115,7 @@
           <w:lang w:eastAsia="ru-RU"/>
         </w:rPr>
       </w:pPr>
-      <w:bookmarkStart w:id="14" w:name="_Toc232191343"/>
+      <w:bookmarkStart w:id="13" w:name="_Toc232191343"/>
       <w:r>
         <w:rPr>
           <w:rFonts w:eastAsia="Times New Roman"/>
@@ -7667,7 +8125,7 @@
         <w:lastRenderedPageBreak/>
         <w:t>Часть задания от предприятия</w:t>
       </w:r>
-      <w:bookmarkEnd w:id="14"/>
+      <w:bookmarkEnd w:id="13"/>
     </w:p>
     <w:p>
       <w:pPr>
@@ -7767,7 +8225,7 @@
           <w:lang w:eastAsia="ru-RU"/>
         </w:rPr>
       </w:pPr>
-      <w:bookmarkStart w:id="15" w:name="_Toc232191344"/>
+      <w:bookmarkStart w:id="14" w:name="_Toc232191344"/>
       <w:r>
         <w:rPr>
           <w:rFonts w:eastAsia="Times New Roman"/>
@@ -7776,7 +8234,7 @@
         <w:lastRenderedPageBreak/>
         <w:t>Заключение</w:t>
       </w:r>
-      <w:bookmarkEnd w:id="15"/>
+      <w:bookmarkEnd w:id="14"/>
     </w:p>
     <w:p>
       <w:pPr>
@@ -7888,7 +8346,7 @@
           <w:lang w:eastAsia="ru-RU"/>
         </w:rPr>
       </w:pPr>
-      <w:bookmarkStart w:id="16" w:name="_Toc232191345"/>
+      <w:bookmarkStart w:id="15" w:name="_Toc232191345"/>
       <w:r>
         <w:rPr>
           <w:rFonts w:eastAsia="Times New Roman"/>
@@ -7900,7 +8358,7 @@
         <w:lastRenderedPageBreak/>
         <w:t>Приложение А.</w:t>
       </w:r>
-      <w:bookmarkEnd w:id="16"/>
+      <w:bookmarkEnd w:id="15"/>
     </w:p>
     <w:p>
       <w:pPr>
@@ -7959,7 +8417,7 @@
       </w:pPr>
     </w:p>
     <w:sectPr>
-      <w:footerReference w:type="default" r:id="rId9"/>
+      <w:footerReference w:type="default" r:id="rId11"/>
       <w:pgSz w:w="11906" w:h="16838"/>
       <w:pgMar w:top="1134" w:right="851" w:bottom="1134" w:left="1701" w:header="709" w:footer="709" w:gutter="0"/>
       <w:pgNumType w:start="0"/>
@@ -7972,7 +8430,7 @@
 </file>
 
 <file path=word/endnotes.xml><?xml version="1.0" encoding="utf-8"?>
-<w:endnotes xmlns:wpc="http://schemas.microsoft.com/office/word/2010/wordprocessingCanvas" xmlns:cx="http://schemas.microsoft.com/office/drawing/2014/chartex" xmlns:mc="http://schemas.openxmlformats.org/markup-compatibility/2006" xmlns:o="urn:schemas-microsoft-com:office:office" xmlns:r="http://schemas.openxmlformats.org/officeDocument/2006/relationships" xmlns:m="http://schemas.openxmlformats.org/officeDocument/2006/math" xmlns:v="urn:schemas-microsoft-com:vml" xmlns:wp14="http://schemas.microsoft.com/office/word/2010/wordprocessingDrawing" xmlns:wp="http://schemas.openxmlformats.org/drawingml/2006/wordprocessingDrawing" xmlns:w10="urn:schemas-microsoft-com:office:word" xmlns:w="http://schemas.openxmlformats.org/wordprocessingml/2006/main" xmlns:w14="http://schemas.microsoft.com/office/word/2010/wordml" xmlns:w15="http://schemas.microsoft.com/office/word/2012/wordml" xmlns:w16se="http://schemas.microsoft.com/office/word/2015/wordml/symex" xmlns:wpg="http://schemas.microsoft.com/office/word/2010/wordprocessingGroup" xmlns:wpi="http://schemas.microsoft.com/office/word/2010/wordprocessingInk" xmlns:wne="http://schemas.microsoft.com/office/word/2006/wordml" xmlns:wps="http://schemas.microsoft.com/office/word/2010/wordprocessingShape" mc:Ignorable="w14 w15 w16se wp14">
+<w:endnotes xmlns:wpc="http://schemas.microsoft.com/office/word/2010/wordprocessingCanvas" xmlns:cx="http://schemas.microsoft.com/office/drawing/2014/chartex" xmlns:cx1="http://schemas.microsoft.com/office/drawing/2015/9/8/chartex" xmlns:cx2="http://schemas.microsoft.com/office/drawing/2015/10/21/chartex" xmlns:cx3="http://schemas.microsoft.com/office/drawing/2016/5/9/chartex" xmlns:cx4="http://schemas.microsoft.com/office/drawing/2016/5/10/chartex" xmlns:cx5="http://schemas.microsoft.com/office/drawing/2016/5/11/chartex" xmlns:cx6="http://schemas.microsoft.com/office/drawing/2016/5/12/chartex" xmlns:cx7="http://schemas.microsoft.com/office/drawing/2016/5/13/chartex" xmlns:cx8="http://schemas.microsoft.com/office/drawing/2016/5/14/chartex" xmlns:mc="http://schemas.openxmlformats.org/markup-compatibility/2006" xmlns:aink="http://schemas.microsoft.com/office/drawing/2016/ink" xmlns:am3d="http://schemas.microsoft.com/office/drawing/2017/model3d" xmlns:o="urn:schemas-microsoft-com:office:office" xmlns:oel="http://schemas.microsoft.com/office/2019/extlst" xmlns:r="http://schemas.openxmlformats.org/officeDocument/2006/relationships" xmlns:m="http://schemas.openxmlformats.org/officeDocument/2006/math" xmlns:v="urn:schemas-microsoft-com:vml" xmlns:wp14="http://schemas.microsoft.com/office/word/2010/wordprocessingDrawing" xmlns:wp="http://schemas.openxmlformats.org/drawingml/2006/wordprocessingDrawing" xmlns:w10="urn:schemas-microsoft-com:office:word" xmlns:w="http://schemas.openxmlformats.org/wordprocessingml/2006/main" xmlns:w14="http://schemas.microsoft.com/office/word/2010/wordml" xmlns:w15="http://schemas.microsoft.com/office/word/2012/wordml" xmlns:w16cex="http://schemas.microsoft.com/office/word/2018/wordml/cex" xmlns:w16cid="http://schemas.microsoft.com/office/word/2016/wordml/cid" xmlns:w16="http://schemas.microsoft.com/office/word/2018/wordml" xmlns:w16du="http://schemas.microsoft.com/office/word/2023/wordml/word16du" xmlns:w16sdtdh="http://schemas.microsoft.com/office/word/2020/wordml/sdtdatahash" xmlns:w16sdtfl="http://schemas.microsoft.com/office/word/2024/wordml/sdtformatlock" xmlns:w16se="http://schemas.microsoft.com/office/word/2015/wordml/symex" xmlns:wpg="http://schemas.microsoft.com/office/word/2010/wordprocessingGroup" xmlns:wpi="http://schemas.microsoft.com/office/word/2010/wordprocessingInk" xmlns:wne="http://schemas.microsoft.com/office/word/2006/wordml" xmlns:wps="http://schemas.microsoft.com/office/word/2010/wordprocessingShape" mc:Ignorable="w14 w15 w16se w16cid w16 w16cex w16sdtdh w16sdtfl w16du wp14">
   <w:endnote w:type="separator" w:id="-1">
     <w:p>
       <w:pPr>
@@ -7997,7 +8455,7 @@
 </file>
 
 <file path=word/footer1.xml><?xml version="1.0" encoding="utf-8"?>
-<w:ftr xmlns:wpc="http://schemas.microsoft.com/office/word/2010/wordprocessingCanvas" xmlns:cx="http://schemas.microsoft.com/office/drawing/2014/chartex" xmlns:mc="http://schemas.openxmlformats.org/markup-compatibility/2006" xmlns:o="urn:schemas-microsoft-com:office:office" xmlns:r="http://schemas.openxmlformats.org/officeDocument/2006/relationships" xmlns:m="http://schemas.openxmlformats.org/officeDocument/2006/math" xmlns:v="urn:schemas-microsoft-com:vml" xmlns:wp14="http://schemas.microsoft.com/office/word/2010/wordprocessingDrawing" xmlns:wp="http://schemas.openxmlformats.org/drawingml/2006/wordprocessingDrawing" xmlns:w10="urn:schemas-microsoft-com:office:word" xmlns:w="http://schemas.openxmlformats.org/wordprocessingml/2006/main" xmlns:w14="http://schemas.microsoft.com/office/word/2010/wordml" xmlns:w15="http://schemas.microsoft.com/office/word/2012/wordml" xmlns:w16se="http://schemas.microsoft.com/office/word/2015/wordml/symex" xmlns:wpg="http://schemas.microsoft.com/office/word/2010/wordprocessingGroup" xmlns:wpi="http://schemas.microsoft.com/office/word/2010/wordprocessingInk" xmlns:wne="http://schemas.microsoft.com/office/word/2006/wordml" xmlns:wps="http://schemas.microsoft.com/office/word/2010/wordprocessingShape" mc:Ignorable="w14 w15 w16se wp14">
+<w:ftr xmlns:wpc="http://schemas.microsoft.com/office/word/2010/wordprocessingCanvas" xmlns:cx="http://schemas.microsoft.com/office/drawing/2014/chartex" xmlns:cx1="http://schemas.microsoft.com/office/drawing/2015/9/8/chartex" xmlns:cx2="http://schemas.microsoft.com/office/drawing/2015/10/21/chartex" xmlns:cx3="http://schemas.microsoft.com/office/drawing/2016/5/9/chartex" xmlns:cx4="http://schemas.microsoft.com/office/drawing/2016/5/10/chartex" xmlns:cx5="http://schemas.microsoft.com/office/drawing/2016/5/11/chartex" xmlns:cx6="http://schemas.microsoft.com/office/drawing/2016/5/12/chartex" xmlns:cx7="http://schemas.microsoft.com/office/drawing/2016/5/13/chartex" xmlns:cx8="http://schemas.microsoft.com/office/drawing/2016/5/14/chartex" xmlns:mc="http://schemas.openxmlformats.org/markup-compatibility/2006" xmlns:aink="http://schemas.microsoft.com/office/drawing/2016/ink" xmlns:am3d="http://schemas.microsoft.com/office/drawing/2017/model3d" xmlns:o="urn:schemas-microsoft-com:office:office" xmlns:oel="http://schemas.microsoft.com/office/2019/extlst" xmlns:r="http://schemas.openxmlformats.org/officeDocument/2006/relationships" xmlns:m="http://schemas.openxmlformats.org/officeDocument/2006/math" xmlns:v="urn:schemas-microsoft-com:vml" xmlns:wp14="http://schemas.microsoft.com/office/word/2010/wordprocessingDrawing" xmlns:wp="http://schemas.openxmlformats.org/drawingml/2006/wordprocessingDrawing" xmlns:w10="urn:schemas-microsoft-com:office:word" xmlns:w="http://schemas.openxmlformats.org/wordprocessingml/2006/main" xmlns:w14="http://schemas.microsoft.com/office/word/2010/wordml" xmlns:w15="http://schemas.microsoft.com/office/word/2012/wordml" xmlns:w16cex="http://schemas.microsoft.com/office/word/2018/wordml/cex" xmlns:w16cid="http://schemas.microsoft.com/office/word/2016/wordml/cid" xmlns:w16="http://schemas.microsoft.com/office/word/2018/wordml" xmlns:w16du="http://schemas.microsoft.com/office/word/2023/wordml/word16du" xmlns:w16sdtdh="http://schemas.microsoft.com/office/word/2020/wordml/sdtdatahash" xmlns:w16sdtfl="http://schemas.microsoft.com/office/word/2024/wordml/sdtformatlock" xmlns:w16se="http://schemas.microsoft.com/office/word/2015/wordml/symex" xmlns:wpg="http://schemas.microsoft.com/office/word/2010/wordprocessingGroup" xmlns:wpi="http://schemas.microsoft.com/office/word/2010/wordprocessingInk" xmlns:wne="http://schemas.microsoft.com/office/word/2006/wordml" xmlns:wps="http://schemas.microsoft.com/office/word/2010/wordprocessingShape" mc:Ignorable="w14 w15 w16se w16cid w16 w16cex w16sdtdh w16sdtfl w16du wp14">
   <w:sdt>
     <w:sdtPr>
       <w:id w:val="1608001705"/>
@@ -8042,7 +8500,7 @@
 </file>
 
 <file path=word/footnotes.xml><?xml version="1.0" encoding="utf-8"?>
-<w:footnotes xmlns:wpc="http://schemas.microsoft.com/office/word/2010/wordprocessingCanvas" xmlns:cx="http://schemas.microsoft.com/office/drawing/2014/chartex" xmlns:mc="http://schemas.openxmlformats.org/markup-compatibility/2006" xmlns:o="urn:schemas-microsoft-com:office:office" xmlns:r="http://schemas.openxmlformats.org/officeDocument/2006/relationships" xmlns:m="http://schemas.openxmlformats.org/officeDocument/2006/math" xmlns:v="urn:schemas-microsoft-com:vml" xmlns:wp14="http://schemas.microsoft.com/office/word/2010/wordprocessingDrawing" xmlns:wp="http://schemas.openxmlformats.org/drawingml/2006/wordprocessingDrawing" xmlns:w10="urn:schemas-microsoft-com:office:word" xmlns:w="http://schemas.openxmlformats.org/wordprocessingml/2006/main" xmlns:w14="http://schemas.microsoft.com/office/word/2010/wordml" xmlns:w15="http://schemas.microsoft.com/office/word/2012/wordml" xmlns:w16se="http://schemas.microsoft.com/office/word/2015/wordml/symex" xmlns:wpg="http://schemas.microsoft.com/office/word/2010/wordprocessingGroup" xmlns:wpi="http://schemas.microsoft.com/office/word/2010/wordprocessingInk" xmlns:wne="http://schemas.microsoft.com/office/word/2006/wordml" xmlns:wps="http://schemas.microsoft.com/office/word/2010/wordprocessingShape" mc:Ignorable="w14 w15 w16se wp14">
+<w:footnotes xmlns:wpc="http://schemas.microsoft.com/office/word/2010/wordprocessingCanvas" xmlns:cx="http://schemas.microsoft.com/office/drawing/2014/chartex" xmlns:cx1="http://schemas.microsoft.com/office/drawing/2015/9/8/chartex" xmlns:cx2="http://schemas.microsoft.com/office/drawing/2015/10/21/chartex" xmlns:cx3="http://schemas.microsoft.com/office/drawing/2016/5/9/chartex" xmlns:cx4="http://schemas.microsoft.com/office/drawing/2016/5/10/chartex" xmlns:cx5="http://schemas.microsoft.com/office/drawing/2016/5/11/chartex" xmlns:cx6="http://schemas.microsoft.com/office/drawing/2016/5/12/chartex" xmlns:cx7="http://schemas.microsoft.com/office/drawing/2016/5/13/chartex" xmlns:cx8="http://schemas.microsoft.com/office/drawing/2016/5/14/chartex" xmlns:mc="http://schemas.openxmlformats.org/markup-compatibility/2006" xmlns:aink="http://schemas.microsoft.com/office/drawing/2016/ink" xmlns:am3d="http://schemas.microsoft.com/office/drawing/2017/model3d" xmlns:o="urn:schemas-microsoft-com:office:office" xmlns:oel="http://schemas.microsoft.com/office/2019/extlst" xmlns:r="http://schemas.openxmlformats.org/officeDocument/2006/relationships" xmlns:m="http://schemas.openxmlformats.org/officeDocument/2006/math" xmlns:v="urn:schemas-microsoft-com:vml" xmlns:wp14="http://schemas.microsoft.com/office/word/2010/wordprocessingDrawing" xmlns:wp="http://schemas.openxmlformats.org/drawingml/2006/wordprocessingDrawing" xmlns:w10="urn:schemas-microsoft-com:office:word" xmlns:w="http://schemas.openxmlformats.org/wordprocessingml/2006/main" xmlns:w14="http://schemas.microsoft.com/office/word/2010/wordml" xmlns:w15="http://schemas.microsoft.com/office/word/2012/wordml" xmlns:w16cex="http://schemas.microsoft.com/office/word/2018/wordml/cex" xmlns:w16cid="http://schemas.microsoft.com/office/word/2016/wordml/cid" xmlns:w16="http://schemas.microsoft.com/office/word/2018/wordml" xmlns:w16du="http://schemas.microsoft.com/office/word/2023/wordml/word16du" xmlns:w16sdtdh="http://schemas.microsoft.com/office/word/2020/wordml/sdtdatahash" xmlns:w16sdtfl="http://schemas.microsoft.com/office/word/2024/wordml/sdtformatlock" xmlns:w16se="http://schemas.microsoft.com/office/word/2015/wordml/symex" xmlns:wpg="http://schemas.microsoft.com/office/word/2010/wordprocessingGroup" xmlns:wpi="http://schemas.microsoft.com/office/word/2010/wordprocessingInk" xmlns:wne="http://schemas.microsoft.com/office/word/2006/wordml" xmlns:wps="http://schemas.microsoft.com/office/word/2010/wordprocessingShape" mc:Ignorable="w14 w15 w16se w16cid w16 w16cex w16sdtdh w16sdtfl w16du wp14">
   <w:footnote w:type="separator" w:id="-1">
     <w:p>
       <w:pPr>
@@ -8067,8 +8525,118 @@
 </file>
 
 <file path=word/numbering.xml><?xml version="1.0" encoding="utf-8"?>
-<w:numbering xmlns:wpc="http://schemas.microsoft.com/office/word/2010/wordprocessingCanvas" xmlns:cx="http://schemas.microsoft.com/office/drawing/2014/chartex" xmlns:mc="http://schemas.openxmlformats.org/markup-compatibility/2006" xmlns:o="urn:schemas-microsoft-com:office:office" xmlns:r="http://schemas.openxmlformats.org/officeDocument/2006/relationships" xmlns:m="http://schemas.openxmlformats.org/officeDocument/2006/math" xmlns:v="urn:schemas-microsoft-com:vml" xmlns:wp14="http://schemas.microsoft.com/office/word/2010/wordprocessingDrawing" xmlns:wp="http://schemas.openxmlformats.org/drawingml/2006/wordprocessingDrawing" xmlns:w10="urn:schemas-microsoft-com:office:word" xmlns:w="http://schemas.openxmlformats.org/wordprocessingml/2006/main" xmlns:w14="http://schemas.microsoft.com/office/word/2010/wordml" xmlns:w15="http://schemas.microsoft.com/office/word/2012/wordml" xmlns:w16se="http://schemas.microsoft.com/office/word/2015/wordml/symex" xmlns:wpg="http://schemas.microsoft.com/office/word/2010/wordprocessingGroup" xmlns:wpi="http://schemas.microsoft.com/office/word/2010/wordprocessingInk" xmlns:wne="http://schemas.microsoft.com/office/word/2006/wordml" xmlns:wps="http://schemas.microsoft.com/office/word/2010/wordprocessingShape" mc:Ignorable="w14 w15 w16se wp14">
+<w:numbering xmlns:wpc="http://schemas.microsoft.com/office/word/2010/wordprocessingCanvas" xmlns:cx="http://schemas.microsoft.com/office/drawing/2014/chartex" xmlns:cx1="http://schemas.microsoft.com/office/drawing/2015/9/8/chartex" xmlns:cx2="http://schemas.microsoft.com/office/drawing/2015/10/21/chartex" xmlns:cx3="http://schemas.microsoft.com/office/drawing/2016/5/9/chartex" xmlns:cx4="http://schemas.microsoft.com/office/drawing/2016/5/10/chartex" xmlns:cx5="http://schemas.microsoft.com/office/drawing/2016/5/11/chartex" xmlns:cx6="http://schemas.microsoft.com/office/drawing/2016/5/12/chartex" xmlns:cx7="http://schemas.microsoft.com/office/drawing/2016/5/13/chartex" xmlns:cx8="http://schemas.microsoft.com/office/drawing/2016/5/14/chartex" xmlns:mc="http://schemas.openxmlformats.org/markup-compatibility/2006" xmlns:aink="http://schemas.microsoft.com/office/drawing/2016/ink" xmlns:am3d="http://schemas.microsoft.com/office/drawing/2017/model3d" xmlns:o="urn:schemas-microsoft-com:office:office" xmlns:oel="http://schemas.microsoft.com/office/2019/extlst" xmlns:r="http://schemas.openxmlformats.org/officeDocument/2006/relationships" xmlns:m="http://schemas.openxmlformats.org/officeDocument/2006/math" xmlns:v="urn:schemas-microsoft-com:vml" xmlns:wp14="http://schemas.microsoft.com/office/word/2010/wordprocessingDrawing" xmlns:wp="http://schemas.openxmlformats.org/drawingml/2006/wordprocessingDrawing" xmlns:w10="urn:schemas-microsoft-com:office:word" xmlns:w="http://schemas.openxmlformats.org/wordprocessingml/2006/main" xmlns:w14="http://schemas.microsoft.com/office/word/2010/wordml" xmlns:w15="http://schemas.microsoft.com/office/word/2012/wordml" xmlns:w16cex="http://schemas.microsoft.com/office/word/2018/wordml/cex" xmlns:w16cid="http://schemas.microsoft.com/office/word/2016/wordml/cid" xmlns:w16="http://schemas.microsoft.com/office/word/2018/wordml" xmlns:w16du="http://schemas.microsoft.com/office/word/2023/wordml/word16du" xmlns:w16sdtdh="http://schemas.microsoft.com/office/word/2020/wordml/sdtdatahash" xmlns:w16sdtfl="http://schemas.microsoft.com/office/word/2024/wordml/sdtformatlock" xmlns:w16se="http://schemas.microsoft.com/office/word/2015/wordml/symex" xmlns:wpg="http://schemas.microsoft.com/office/word/2010/wordprocessingGroup" xmlns:wpi="http://schemas.microsoft.com/office/word/2010/wordprocessingInk" xmlns:wne="http://schemas.microsoft.com/office/word/2006/wordml" xmlns:wps="http://schemas.microsoft.com/office/word/2010/wordprocessingShape" mc:Ignorable="w14 w15 w16se w16cid w16 w16cex w16sdtdh w16sdtfl w16du wp14">
   <w:abstractNum w:abstractNumId="0" w15:restartNumberingAfterBreak="0">
+    <w:nsid w:val="01802D34"/>
+    <w:multiLevelType w:val="multilevel"/>
+    <w:tmpl w:val="EE8AA946"/>
+    <w:lvl w:ilvl="0">
+      <w:start w:val="1"/>
+      <w:numFmt w:val="decimal"/>
+      <w:lvlText w:val="%1."/>
+      <w:lvlJc w:val="left"/>
+      <w:pPr>
+        <w:tabs>
+          <w:tab w:val="num" w:pos="720"/>
+        </w:tabs>
+        <w:ind w:left="720" w:hanging="360"/>
+      </w:pPr>
+    </w:lvl>
+    <w:lvl w:ilvl="1">
+      <w:start w:val="1"/>
+      <w:numFmt w:val="decimal"/>
+      <w:lvlText w:val="%2."/>
+      <w:lvlJc w:val="left"/>
+      <w:pPr>
+        <w:ind w:left="1440" w:hanging="360"/>
+      </w:pPr>
+    </w:lvl>
+    <w:lvl w:ilvl="2" w:tentative="1">
+      <w:start w:val="1"/>
+      <w:numFmt w:val="decimal"/>
+      <w:lvlText w:val="%3."/>
+      <w:lvlJc w:val="left"/>
+      <w:pPr>
+        <w:tabs>
+          <w:tab w:val="num" w:pos="2160"/>
+        </w:tabs>
+        <w:ind w:left="2160" w:hanging="360"/>
+      </w:pPr>
+    </w:lvl>
+    <w:lvl w:ilvl="3" w:tentative="1">
+      <w:start w:val="1"/>
+      <w:numFmt w:val="decimal"/>
+      <w:lvlText w:val="%4."/>
+      <w:lvlJc w:val="left"/>
+      <w:pPr>
+        <w:tabs>
+          <w:tab w:val="num" w:pos="2880"/>
+        </w:tabs>
+        <w:ind w:left="2880" w:hanging="360"/>
+      </w:pPr>
+    </w:lvl>
+    <w:lvl w:ilvl="4" w:tentative="1">
+      <w:start w:val="1"/>
+      <w:numFmt w:val="decimal"/>
+      <w:lvlText w:val="%5."/>
+      <w:lvlJc w:val="left"/>
+      <w:pPr>
+        <w:tabs>
+          <w:tab w:val="num" w:pos="3600"/>
+        </w:tabs>
+        <w:ind w:left="3600" w:hanging="360"/>
+      </w:pPr>
+    </w:lvl>
+    <w:lvl w:ilvl="5" w:tentative="1">
+      <w:start w:val="1"/>
+      <w:numFmt w:val="decimal"/>
+      <w:lvlText w:val="%6."/>
+      <w:lvlJc w:val="left"/>
+      <w:pPr>
+        <w:tabs>
+          <w:tab w:val="num" w:pos="4320"/>
+        </w:tabs>
+        <w:ind w:left="4320" w:hanging="360"/>
+      </w:pPr>
+    </w:lvl>
+    <w:lvl w:ilvl="6" w:tentative="1">
+      <w:start w:val="1"/>
+      <w:numFmt w:val="decimal"/>
+      <w:lvlText w:val="%7."/>
+      <w:lvlJc w:val="left"/>
+      <w:pPr>
+        <w:tabs>
+          <w:tab w:val="num" w:pos="5040"/>
+        </w:tabs>
+        <w:ind w:left="5040" w:hanging="360"/>
+      </w:pPr>
+    </w:lvl>
+    <w:lvl w:ilvl="7" w:tentative="1">
+      <w:start w:val="1"/>
+      <w:numFmt w:val="decimal"/>
+      <w:lvlText w:val="%8."/>
+      <w:lvlJc w:val="left"/>
+      <w:pPr>
+        <w:tabs>
+          <w:tab w:val="num" w:pos="5760"/>
+        </w:tabs>
+        <w:ind w:left="5760" w:hanging="360"/>
+      </w:pPr>
+    </w:lvl>
+    <w:lvl w:ilvl="8" w:tentative="1">
+      <w:start w:val="1"/>
+      <w:numFmt w:val="decimal"/>
+      <w:lvlText w:val="%9."/>
+      <w:lvlJc w:val="left"/>
+      <w:pPr>
+        <w:tabs>
+          <w:tab w:val="num" w:pos="6480"/>
+        </w:tabs>
+        <w:ind w:left="6480" w:hanging="360"/>
+      </w:pPr>
+    </w:lvl>
+  </w:abstractNum>
+  <w:abstractNum w:abstractNumId="1" w15:restartNumberingAfterBreak="0">
     <w:nsid w:val="0C65268A"/>
     <w:multiLevelType w:val="hybridMultilevel"/>
     <w:tmpl w:val="78329FFC"/>
@@ -8181,7 +8749,7 @@
       </w:rPr>
     </w:lvl>
   </w:abstractNum>
-  <w:abstractNum w:abstractNumId="1" w15:restartNumberingAfterBreak="0">
+  <w:abstractNum w:abstractNumId="2" w15:restartNumberingAfterBreak="0">
     <w:nsid w:val="183D19DC"/>
     <w:multiLevelType w:val="hybridMultilevel"/>
     <w:tmpl w:val="8FB48A10"/>
@@ -8294,7 +8862,124 @@
       </w:rPr>
     </w:lvl>
   </w:abstractNum>
-  <w:abstractNum w:abstractNumId="2" w15:restartNumberingAfterBreak="0">
+  <w:abstractNum w:abstractNumId="3" w15:restartNumberingAfterBreak="0">
+    <w:nsid w:val="270E7118"/>
+    <w:multiLevelType w:val="multilevel"/>
+    <w:tmpl w:val="02E20232"/>
+    <w:lvl w:ilvl="0">
+      <w:start w:val="1"/>
+      <w:numFmt w:val="decimal"/>
+      <w:lvlText w:val="%1."/>
+      <w:lvlJc w:val="left"/>
+      <w:pPr>
+        <w:tabs>
+          <w:tab w:val="num" w:pos="720"/>
+        </w:tabs>
+        <w:ind w:left="720" w:hanging="360"/>
+      </w:pPr>
+    </w:lvl>
+    <w:lvl w:ilvl="1">
+      <w:start w:val="1"/>
+      <w:numFmt w:val="bullet"/>
+      <w:lvlText w:val="o"/>
+      <w:lvlJc w:val="left"/>
+      <w:pPr>
+        <w:tabs>
+          <w:tab w:val="num" w:pos="1440"/>
+        </w:tabs>
+        <w:ind w:left="1440" w:hanging="360"/>
+      </w:pPr>
+      <w:rPr>
+        <w:rFonts w:ascii="Courier New" w:hAnsi="Courier New" w:hint="default"/>
+        <w:sz w:val="20"/>
+      </w:rPr>
+    </w:lvl>
+    <w:lvl w:ilvl="2" w:tentative="1">
+      <w:start w:val="1"/>
+      <w:numFmt w:val="decimal"/>
+      <w:lvlText w:val="%3."/>
+      <w:lvlJc w:val="left"/>
+      <w:pPr>
+        <w:tabs>
+          <w:tab w:val="num" w:pos="2160"/>
+        </w:tabs>
+        <w:ind w:left="2160" w:hanging="360"/>
+      </w:pPr>
+    </w:lvl>
+    <w:lvl w:ilvl="3" w:tentative="1">
+      <w:start w:val="1"/>
+      <w:numFmt w:val="decimal"/>
+      <w:lvlText w:val="%4."/>
+      <w:lvlJc w:val="left"/>
+      <w:pPr>
+        <w:tabs>
+          <w:tab w:val="num" w:pos="2880"/>
+        </w:tabs>
+        <w:ind w:left="2880" w:hanging="360"/>
+      </w:pPr>
+    </w:lvl>
+    <w:lvl w:ilvl="4" w:tentative="1">
+      <w:start w:val="1"/>
+      <w:numFmt w:val="decimal"/>
+      <w:lvlText w:val="%5."/>
+      <w:lvlJc w:val="left"/>
+      <w:pPr>
+        <w:tabs>
+          <w:tab w:val="num" w:pos="3600"/>
+        </w:tabs>
+        <w:ind w:left="3600" w:hanging="360"/>
+      </w:pPr>
+    </w:lvl>
+    <w:lvl w:ilvl="5" w:tentative="1">
+      <w:start w:val="1"/>
+      <w:numFmt w:val="decimal"/>
+      <w:lvlText w:val="%6."/>
+      <w:lvlJc w:val="left"/>
+      <w:pPr>
+        <w:tabs>
+          <w:tab w:val="num" w:pos="4320"/>
+        </w:tabs>
+        <w:ind w:left="4320" w:hanging="360"/>
+      </w:pPr>
+    </w:lvl>
+    <w:lvl w:ilvl="6" w:tentative="1">
+      <w:start w:val="1"/>
+      <w:numFmt w:val="decimal"/>
+      <w:lvlText w:val="%7."/>
+      <w:lvlJc w:val="left"/>
+      <w:pPr>
+        <w:tabs>
+          <w:tab w:val="num" w:pos="5040"/>
+        </w:tabs>
+        <w:ind w:left="5040" w:hanging="360"/>
+      </w:pPr>
+    </w:lvl>
+    <w:lvl w:ilvl="7" w:tentative="1">
+      <w:start w:val="1"/>
+      <w:numFmt w:val="decimal"/>
+      <w:lvlText w:val="%8."/>
+      <w:lvlJc w:val="left"/>
+      <w:pPr>
+        <w:tabs>
+          <w:tab w:val="num" w:pos="5760"/>
+        </w:tabs>
+        <w:ind w:left="5760" w:hanging="360"/>
+      </w:pPr>
+    </w:lvl>
+    <w:lvl w:ilvl="8" w:tentative="1">
+      <w:start w:val="1"/>
+      <w:numFmt w:val="decimal"/>
+      <w:lvlText w:val="%9."/>
+      <w:lvlJc w:val="left"/>
+      <w:pPr>
+        <w:tabs>
+          <w:tab w:val="num" w:pos="6480"/>
+        </w:tabs>
+        <w:ind w:left="6480" w:hanging="360"/>
+      </w:pPr>
+    </w:lvl>
+  </w:abstractNum>
+  <w:abstractNum w:abstractNumId="4" w15:restartNumberingAfterBreak="0">
     <w:nsid w:val="299D284C"/>
     <w:multiLevelType w:val="hybridMultilevel"/>
     <w:tmpl w:val="2FBC89D4"/>
@@ -8407,7 +9092,7 @@
       </w:rPr>
     </w:lvl>
   </w:abstractNum>
-  <w:abstractNum w:abstractNumId="3" w15:restartNumberingAfterBreak="0">
+  <w:abstractNum w:abstractNumId="5" w15:restartNumberingAfterBreak="0">
     <w:nsid w:val="2A455A74"/>
     <w:multiLevelType w:val="hybridMultilevel"/>
     <w:tmpl w:val="B718CC2A"/>
@@ -8520,7 +9205,7 @@
       </w:rPr>
     </w:lvl>
   </w:abstractNum>
-  <w:abstractNum w:abstractNumId="4" w15:restartNumberingAfterBreak="0">
+  <w:abstractNum w:abstractNumId="6" w15:restartNumberingAfterBreak="0">
     <w:nsid w:val="2D792C9B"/>
     <w:multiLevelType w:val="hybridMultilevel"/>
     <w:tmpl w:val="08BA3BD4"/>
@@ -8633,7 +9318,120 @@
       </w:rPr>
     </w:lvl>
   </w:abstractNum>
-  <w:abstractNum w:abstractNumId="5" w15:restartNumberingAfterBreak="0">
+  <w:abstractNum w:abstractNumId="7" w15:restartNumberingAfterBreak="0">
+    <w:nsid w:val="37171DD2"/>
+    <w:multiLevelType w:val="multilevel"/>
+    <w:tmpl w:val="5AC00926"/>
+    <w:lvl w:ilvl="0">
+      <w:start w:val="1"/>
+      <w:numFmt w:val="decimal"/>
+      <w:lvlText w:val="%1."/>
+      <w:lvlJc w:val="left"/>
+      <w:pPr>
+        <w:tabs>
+          <w:tab w:val="num" w:pos="720"/>
+        </w:tabs>
+        <w:ind w:left="720" w:hanging="360"/>
+      </w:pPr>
+    </w:lvl>
+    <w:lvl w:ilvl="1" w:tentative="1">
+      <w:start w:val="1"/>
+      <w:numFmt w:val="decimal"/>
+      <w:lvlText w:val="%2."/>
+      <w:lvlJc w:val="left"/>
+      <w:pPr>
+        <w:tabs>
+          <w:tab w:val="num" w:pos="1440"/>
+        </w:tabs>
+        <w:ind w:left="1440" w:hanging="360"/>
+      </w:pPr>
+    </w:lvl>
+    <w:lvl w:ilvl="2" w:tentative="1">
+      <w:start w:val="1"/>
+      <w:numFmt w:val="decimal"/>
+      <w:lvlText w:val="%3."/>
+      <w:lvlJc w:val="left"/>
+      <w:pPr>
+        <w:tabs>
+          <w:tab w:val="num" w:pos="2160"/>
+        </w:tabs>
+        <w:ind w:left="2160" w:hanging="360"/>
+      </w:pPr>
+    </w:lvl>
+    <w:lvl w:ilvl="3" w:tentative="1">
+      <w:start w:val="1"/>
+      <w:numFmt w:val="decimal"/>
+      <w:lvlText w:val="%4."/>
+      <w:lvlJc w:val="left"/>
+      <w:pPr>
+        <w:tabs>
+          <w:tab w:val="num" w:pos="2880"/>
+        </w:tabs>
+        <w:ind w:left="2880" w:hanging="360"/>
+      </w:pPr>
+    </w:lvl>
+    <w:lvl w:ilvl="4" w:tentative="1">
+      <w:start w:val="1"/>
+      <w:numFmt w:val="decimal"/>
+      <w:lvlText w:val="%5."/>
+      <w:lvlJc w:val="left"/>
+      <w:pPr>
+        <w:tabs>
+          <w:tab w:val="num" w:pos="3600"/>
+        </w:tabs>
+        <w:ind w:left="3600" w:hanging="360"/>
+      </w:pPr>
+    </w:lvl>
+    <w:lvl w:ilvl="5" w:tentative="1">
+      <w:start w:val="1"/>
+      <w:numFmt w:val="decimal"/>
+      <w:lvlText w:val="%6."/>
+      <w:lvlJc w:val="left"/>
+      <w:pPr>
+        <w:tabs>
+          <w:tab w:val="num" w:pos="4320"/>
+        </w:tabs>
+        <w:ind w:left="4320" w:hanging="360"/>
+      </w:pPr>
+    </w:lvl>
+    <w:lvl w:ilvl="6" w:tentative="1">
+      <w:start w:val="1"/>
+      <w:numFmt w:val="decimal"/>
+      <w:lvlText w:val="%7."/>
+      <w:lvlJc w:val="left"/>
+      <w:pPr>
+        <w:tabs>
+          <w:tab w:val="num" w:pos="5040"/>
+        </w:tabs>
+        <w:ind w:left="5040" w:hanging="360"/>
+      </w:pPr>
+    </w:lvl>
+    <w:lvl w:ilvl="7" w:tentative="1">
+      <w:start w:val="1"/>
+      <w:numFmt w:val="decimal"/>
+      <w:lvlText w:val="%8."/>
+      <w:lvlJc w:val="left"/>
+      <w:pPr>
+        <w:tabs>
+          <w:tab w:val="num" w:pos="5760"/>
+        </w:tabs>
+        <w:ind w:left="5760" w:hanging="360"/>
+      </w:pPr>
+    </w:lvl>
+    <w:lvl w:ilvl="8" w:tentative="1">
+      <w:start w:val="1"/>
+      <w:numFmt w:val="decimal"/>
+      <w:lvlText w:val="%9."/>
+      <w:lvlJc w:val="left"/>
+      <w:pPr>
+        <w:tabs>
+          <w:tab w:val="num" w:pos="6480"/>
+        </w:tabs>
+        <w:ind w:left="6480" w:hanging="360"/>
+      </w:pPr>
+    </w:lvl>
+  </w:abstractNum>
+  <w:abstractNum w:abstractNumId="8" w15:restartNumberingAfterBreak="0">
     <w:nsid w:val="3C541914"/>
     <w:multiLevelType w:val="hybridMultilevel"/>
     <w:tmpl w:val="8EAE55F4"/>
@@ -8746,7 +9544,7 @@
       </w:rPr>
     </w:lvl>
   </w:abstractNum>
-  <w:abstractNum w:abstractNumId="6" w15:restartNumberingAfterBreak="0">
+  <w:abstractNum w:abstractNumId="9" w15:restartNumberingAfterBreak="0">
     <w:nsid w:val="42283FAD"/>
     <w:multiLevelType w:val="hybridMultilevel"/>
     <w:tmpl w:val="2D4E77C2"/>
@@ -8859,7 +9657,7 @@
       </w:rPr>
     </w:lvl>
   </w:abstractNum>
-  <w:abstractNum w:abstractNumId="7" w15:restartNumberingAfterBreak="0">
+  <w:abstractNum w:abstractNumId="10" w15:restartNumberingAfterBreak="0">
     <w:nsid w:val="431E2389"/>
     <w:multiLevelType w:val="hybridMultilevel"/>
     <w:tmpl w:val="CF5813D6"/>
@@ -8972,7 +9770,120 @@
       </w:rPr>
     </w:lvl>
   </w:abstractNum>
-  <w:abstractNum w:abstractNumId="8" w15:restartNumberingAfterBreak="0">
+  <w:abstractNum w:abstractNumId="11" w15:restartNumberingAfterBreak="0">
+    <w:nsid w:val="45452C51"/>
+    <w:multiLevelType w:val="multilevel"/>
+    <w:tmpl w:val="903A7E42"/>
+    <w:lvl w:ilvl="0">
+      <w:start w:val="1"/>
+      <w:numFmt w:val="decimal"/>
+      <w:lvlText w:val="%1."/>
+      <w:lvlJc w:val="left"/>
+      <w:pPr>
+        <w:tabs>
+          <w:tab w:val="num" w:pos="720"/>
+        </w:tabs>
+        <w:ind w:left="720" w:hanging="360"/>
+      </w:pPr>
+    </w:lvl>
+    <w:lvl w:ilvl="1" w:tentative="1">
+      <w:start w:val="1"/>
+      <w:numFmt w:val="decimal"/>
+      <w:lvlText w:val="%2."/>
+      <w:lvlJc w:val="left"/>
+      <w:pPr>
+        <w:tabs>
+          <w:tab w:val="num" w:pos="1440"/>
+        </w:tabs>
+        <w:ind w:left="1440" w:hanging="360"/>
+      </w:pPr>
+    </w:lvl>
+    <w:lvl w:ilvl="2" w:tentative="1">
+      <w:start w:val="1"/>
+      <w:numFmt w:val="decimal"/>
+      <w:lvlText w:val="%3."/>
+      <w:lvlJc w:val="left"/>
+      <w:pPr>
+        <w:tabs>
+          <w:tab w:val="num" w:pos="2160"/>
+        </w:tabs>
+        <w:ind w:left="2160" w:hanging="360"/>
+      </w:pPr>
+    </w:lvl>
+    <w:lvl w:ilvl="3" w:tentative="1">
+      <w:start w:val="1"/>
+      <w:numFmt w:val="decimal"/>
+      <w:lvlText w:val="%4."/>
+      <w:lvlJc w:val="left"/>
+      <w:pPr>
+        <w:tabs>
+          <w:tab w:val="num" w:pos="2880"/>
+        </w:tabs>
+        <w:ind w:left="2880" w:hanging="360"/>
+      </w:pPr>
+    </w:lvl>
+    <w:lvl w:ilvl="4" w:tentative="1">
+      <w:start w:val="1"/>
+      <w:numFmt w:val="decimal"/>
+      <w:lvlText w:val="%5."/>
+      <w:lvlJc w:val="left"/>
+      <w:pPr>
+        <w:tabs>
+          <w:tab w:val="num" w:pos="3600"/>
+        </w:tabs>
+        <w:ind w:left="3600" w:hanging="360"/>
+      </w:pPr>
+    </w:lvl>
+    <w:lvl w:ilvl="5" w:tentative="1">
+      <w:start w:val="1"/>
+      <w:numFmt w:val="decimal"/>
+      <w:lvlText w:val="%6."/>
+      <w:lvlJc w:val="left"/>
+      <w:pPr>
+        <w:tabs>
+          <w:tab w:val="num" w:pos="4320"/>
+        </w:tabs>
+        <w:ind w:left="4320" w:hanging="360"/>
+      </w:pPr>
+    </w:lvl>
+    <w:lvl w:ilvl="6" w:tentative="1">
+      <w:start w:val="1"/>
+      <w:numFmt w:val="decimal"/>
+      <w:lvlText w:val="%7."/>
+      <w:lvlJc w:val="left"/>
+      <w:pPr>
+        <w:tabs>
+          <w:tab w:val="num" w:pos="5040"/>
+        </w:tabs>
+        <w:ind w:left="5040" w:hanging="360"/>
+      </w:pPr>
+    </w:lvl>
+    <w:lvl w:ilvl="7" w:tentative="1">
+      <w:start w:val="1"/>
+      <w:numFmt w:val="decimal"/>
+      <w:lvlText w:val="%8."/>
+      <w:lvlJc w:val="left"/>
+      <w:pPr>
+        <w:tabs>
+          <w:tab w:val="num" w:pos="5760"/>
+        </w:tabs>
+        <w:ind w:left="5760" w:hanging="360"/>
+      </w:pPr>
+    </w:lvl>
+    <w:lvl w:ilvl="8" w:tentative="1">
+      <w:start w:val="1"/>
+      <w:numFmt w:val="decimal"/>
+      <w:lvlText w:val="%9."/>
+      <w:lvlJc w:val="left"/>
+      <w:pPr>
+        <w:tabs>
+          <w:tab w:val="num" w:pos="6480"/>
+        </w:tabs>
+        <w:ind w:left="6480" w:hanging="360"/>
+      </w:pPr>
+    </w:lvl>
+  </w:abstractNum>
+  <w:abstractNum w:abstractNumId="12" w15:restartNumberingAfterBreak="0">
     <w:nsid w:val="4BF40851"/>
     <w:multiLevelType w:val="hybridMultilevel"/>
     <w:tmpl w:val="6D583D42"/>
@@ -9085,7 +9996,7 @@
       </w:rPr>
     </w:lvl>
   </w:abstractNum>
-  <w:abstractNum w:abstractNumId="9" w15:restartNumberingAfterBreak="0">
+  <w:abstractNum w:abstractNumId="13" w15:restartNumberingAfterBreak="0">
     <w:nsid w:val="4DC370AF"/>
     <w:multiLevelType w:val="hybridMultilevel"/>
     <w:tmpl w:val="684CB502"/>
@@ -9174,7 +10085,7 @@
       </w:pPr>
     </w:lvl>
   </w:abstractNum>
-  <w:abstractNum w:abstractNumId="10" w15:restartNumberingAfterBreak="0">
+  <w:abstractNum w:abstractNumId="14" w15:restartNumberingAfterBreak="0">
     <w:nsid w:val="4E4458B9"/>
     <w:multiLevelType w:val="hybridMultilevel"/>
     <w:tmpl w:val="CEAAD774"/>
@@ -9287,7 +10198,7 @@
       </w:rPr>
     </w:lvl>
   </w:abstractNum>
-  <w:abstractNum w:abstractNumId="11" w15:restartNumberingAfterBreak="0">
+  <w:abstractNum w:abstractNumId="15" w15:restartNumberingAfterBreak="0">
     <w:nsid w:val="512F4665"/>
     <w:multiLevelType w:val="hybridMultilevel"/>
     <w:tmpl w:val="9C2CE3E2"/>
@@ -9400,7 +10311,7 @@
       </w:rPr>
     </w:lvl>
   </w:abstractNum>
-  <w:abstractNum w:abstractNumId="12" w15:restartNumberingAfterBreak="0">
+  <w:abstractNum w:abstractNumId="16" w15:restartNumberingAfterBreak="0">
     <w:nsid w:val="558D4C67"/>
     <w:multiLevelType w:val="hybridMultilevel"/>
     <w:tmpl w:val="92A65CB6"/>
@@ -9489,7 +10400,7 @@
       </w:pPr>
     </w:lvl>
   </w:abstractNum>
-  <w:abstractNum w:abstractNumId="13" w15:restartNumberingAfterBreak="0">
+  <w:abstractNum w:abstractNumId="17" w15:restartNumberingAfterBreak="0">
     <w:nsid w:val="6A6C014B"/>
     <w:multiLevelType w:val="hybridMultilevel"/>
     <w:tmpl w:val="AF6A0662"/>
@@ -9575,7 +10486,7 @@
       </w:pPr>
     </w:lvl>
   </w:abstractNum>
-  <w:abstractNum w:abstractNumId="14" w15:restartNumberingAfterBreak="0">
+  <w:abstractNum w:abstractNumId="18" w15:restartNumberingAfterBreak="0">
     <w:nsid w:val="76EB5A7F"/>
     <w:multiLevelType w:val="multilevel"/>
     <w:tmpl w:val="2D488A44"/>
@@ -9696,7 +10607,7 @@
       </w:rPr>
     </w:lvl>
   </w:abstractNum>
-  <w:abstractNum w:abstractNumId="15" w15:restartNumberingAfterBreak="0">
+  <w:abstractNum w:abstractNumId="19" w15:restartNumberingAfterBreak="0">
     <w:nsid w:val="7E206243"/>
     <w:multiLevelType w:val="hybridMultilevel"/>
     <w:tmpl w:val="BA387EB4"/>
@@ -9809,60 +10720,72 @@
       </w:rPr>
     </w:lvl>
   </w:abstractNum>
-  <w:num w:numId="1">
+  <w:num w:numId="1" w16cid:durableId="1979148097">
+    <w:abstractNumId w:val="16"/>
+  </w:num>
+  <w:num w:numId="2" w16cid:durableId="493574814">
+    <w:abstractNumId w:val="6"/>
+  </w:num>
+  <w:num w:numId="3" w16cid:durableId="148716897">
+    <w:abstractNumId w:val="1"/>
+  </w:num>
+  <w:num w:numId="4" w16cid:durableId="553349759">
+    <w:abstractNumId w:val="18"/>
+  </w:num>
+  <w:num w:numId="5" w16cid:durableId="809860307">
+    <w:abstractNumId w:val="19"/>
+  </w:num>
+  <w:num w:numId="6" w16cid:durableId="1874149215">
+    <w:abstractNumId w:val="13"/>
+  </w:num>
+  <w:num w:numId="7" w16cid:durableId="1219978416">
     <w:abstractNumId w:val="12"/>
   </w:num>
-  <w:num w:numId="2">
+  <w:num w:numId="8" w16cid:durableId="1727994245">
+    <w:abstractNumId w:val="15"/>
+  </w:num>
+  <w:num w:numId="9" w16cid:durableId="440300884">
+    <w:abstractNumId w:val="10"/>
+  </w:num>
+  <w:num w:numId="10" w16cid:durableId="1987590699">
     <w:abstractNumId w:val="4"/>
   </w:num>
-  <w:num w:numId="3">
-    <w:abstractNumId w:val="0"/>
+  <w:num w:numId="11" w16cid:durableId="497575852">
+    <w:abstractNumId w:val="5"/>
   </w:num>
-  <w:num w:numId="4">
+  <w:num w:numId="12" w16cid:durableId="745808471">
+    <w:abstractNumId w:val="2"/>
+  </w:num>
+  <w:num w:numId="13" w16cid:durableId="538200465">
+    <w:abstractNumId w:val="9"/>
+  </w:num>
+  <w:num w:numId="14" w16cid:durableId="1490095361">
     <w:abstractNumId w:val="14"/>
   </w:num>
-  <w:num w:numId="5">
-    <w:abstractNumId w:val="15"/>
+  <w:num w:numId="15" w16cid:durableId="781415548">
+    <w:abstractNumId w:val="17"/>
   </w:num>
-  <w:num w:numId="6">
-    <w:abstractNumId w:val="9"/>
-  </w:num>
-  <w:num w:numId="7">
+  <w:num w:numId="16" w16cid:durableId="334842385">
     <w:abstractNumId w:val="8"/>
   </w:num>
-  <w:num w:numId="8">
+  <w:num w:numId="17" w16cid:durableId="497424063">
     <w:abstractNumId w:val="11"/>
   </w:num>
-  <w:num w:numId="9">
+  <w:num w:numId="18" w16cid:durableId="613830588">
     <w:abstractNumId w:val="7"/>
   </w:num>
-  <w:num w:numId="10">
-    <w:abstractNumId w:val="2"/>
-  </w:num>
-  <w:num w:numId="11">
+  <w:num w:numId="19" w16cid:durableId="1159888211">
     <w:abstractNumId w:val="3"/>
   </w:num>
-  <w:num w:numId="12">
-    <w:abstractNumId w:val="1"/>
-  </w:num>
-  <w:num w:numId="13">
-    <w:abstractNumId w:val="6"/>
-  </w:num>
-  <w:num w:numId="14">
-    <w:abstractNumId w:val="10"/>
-  </w:num>
-  <w:num w:numId="15">
-    <w:abstractNumId w:val="13"/>
-  </w:num>
-  <w:num w:numId="16">
-    <w:abstractNumId w:val="5"/>
+  <w:num w:numId="20" w16cid:durableId="1562328687">
+    <w:abstractNumId w:val="0"/>
   </w:num>
   <w:numIdMacAtCleanup w:val="11"/>
 </w:numbering>
 </file>
 
 <file path=word/styles.xml><?xml version="1.0" encoding="utf-8"?>
-<w:styles xmlns:mc="http://schemas.openxmlformats.org/markup-compatibility/2006" xmlns:r="http://schemas.openxmlformats.org/officeDocument/2006/relationships" xmlns:w="http://schemas.openxmlformats.org/wordprocessingml/2006/main" xmlns:w14="http://schemas.microsoft.com/office/word/2010/wordml" xmlns:w15="http://schemas.microsoft.com/office/word/2012/wordml" xmlns:w16se="http://schemas.microsoft.com/office/word/2015/wordml/symex" mc:Ignorable="w14 w15 w16se">
+<w:styles xmlns:mc="http://schemas.openxmlformats.org/markup-compatibility/2006" xmlns:r="http://schemas.openxmlformats.org/officeDocument/2006/relationships" xmlns:w="http://schemas.openxmlformats.org/wordprocessingml/2006/main" xmlns:w14="http://schemas.microsoft.com/office/word/2010/wordml" xmlns:w15="http://schemas.microsoft.com/office/word/2012/wordml" xmlns:w16cex="http://schemas.microsoft.com/office/word/2018/wordml/cex" xmlns:w16cid="http://schemas.microsoft.com/office/word/2016/wordml/cid" xmlns:w16="http://schemas.microsoft.com/office/word/2018/wordml" xmlns:w16du="http://schemas.microsoft.com/office/word/2023/wordml/word16du" xmlns:w16sdtdh="http://schemas.microsoft.com/office/word/2020/wordml/sdtdatahash" xmlns:w16sdtfl="http://schemas.microsoft.com/office/word/2024/wordml/sdtformatlock" xmlns:w16se="http://schemas.microsoft.com/office/word/2015/wordml/symex" mc:Ignorable="w14 w15 w16se w16cid w16 w16cex w16sdtdh w16sdtfl w16du">
   <w:docDefaults>
     <w:rPrDefault>
       <w:rPr>
@@ -9878,7 +10801,7 @@
       </w:pPr>
     </w:pPrDefault>
   </w:docDefaults>
-  <w:latentStyles w:defLockedState="0" w:defUIPriority="99" w:defSemiHidden="0" w:defUnhideWhenUsed="0" w:defQFormat="0" w:count="371">
+  <w:latentStyles w:defLockedState="0" w:defUIPriority="99" w:defSemiHidden="0" w:defUnhideWhenUsed="0" w:defQFormat="0" w:count="376">
     <w:lsdException w:name="Normal" w:uiPriority="0" w:qFormat="1"/>
     <w:lsdException w:name="heading 1" w:uiPriority="9" w:qFormat="1"/>
     <w:lsdException w:name="heading 2" w:semiHidden="1" w:uiPriority="9" w:unhideWhenUsed="1" w:qFormat="1"/>
@@ -10250,6 +11173,11 @@
     <w:lsdException w:name="List Table 5 Dark Accent 6" w:uiPriority="50"/>
     <w:lsdException w:name="List Table 6 Colorful Accent 6" w:uiPriority="51"/>
     <w:lsdException w:name="List Table 7 Colorful Accent 6" w:uiPriority="52"/>
+    <w:lsdException w:name="Mention" w:semiHidden="1" w:unhideWhenUsed="1"/>
+    <w:lsdException w:name="Smart Hyperlink" w:semiHidden="1" w:unhideWhenUsed="1"/>
+    <w:lsdException w:name="Hashtag" w:semiHidden="1" w:unhideWhenUsed="1"/>
+    <w:lsdException w:name="Unresolved Mention" w:semiHidden="1" w:unhideWhenUsed="1"/>
+    <w:lsdException w:name="Smart Link" w:semiHidden="1" w:unhideWhenUsed="1"/>
   </w:latentStyles>
   <w:style w:type="paragraph" w:default="1" w:styleId="a">
     <w:name w:val="Normal"/>
@@ -10353,7 +11281,6 @@
   <w:style w:type="character" w:default="1" w:styleId="a0">
     <w:name w:val="Default Paragraph Font"/>
     <w:uiPriority w:val="1"/>
-    <w:semiHidden/>
     <w:unhideWhenUsed/>
   </w:style>
   <w:style w:type="table" w:default="1" w:styleId="a1">

</xml_diff>